<commit_message>
Update documentation for localization
Technical documentation (EN) gets a localization section and the new
command line options; the Hungarian user guide now uses the Hungarian
screen labels and explains language switching and editing locals.json.
Numbered lists in the generated documents restart at 1.

Co-Authored-By: Claude Opus 5.5 <noreply@anthropic.com>
</commit_message>
<xml_diff>
--- a/docs/TrademarkImage_Felhasznaloi_kezikonyv_HU.docx
+++ b/docs/TrademarkImage_Felhasznaloi_kezikonyv_HU.docx
@@ -12,7 +12,7 @@
           <w:color w:val="1F3A5F"/>
           <w:sz w:val="48"/>
         </w:rPr>
-        <w:t>Trademark Image Checker</w:t>
+        <w:t>Védjegykép-ellenőrző</w:t>
       </w:r>
     </w:p>
     <w:p>
@@ -24,7 +24,7 @@
           <w:color w:val="555555"/>
           <w:sz w:val="24"/>
         </w:rPr>
-        <w:t>Felhasználói kézikönyv (1.0.0 verzió)</w:t>
+        <w:t>Felhasználói kézikönyv (Trademark Image Checker, 1.1.0 verzió)</w:t>
       </w:r>
     </w:p>
     <w:p>
@@ -37,7 +37,7 @@
     </w:p>
     <w:p>
       <w:r>
-        <w:t>A Trademark Image Checker egy képfájlról megállapítja, hogy megfelel-e a beállított feltételeknek (fájlméret, képméret pixelben, felbontás, képtípus), például egy védjegybejelentéshez feltöltendő kép követelményeinek. Ha a kép nem felel meg, a program segít beállítani a megfelelő értékeket, majd elkészíti és elmenti az átalakított képet.</w:t>
+        <w:t>A Védjegykép-ellenőrző egy képfájlról megállapítja, hogy megfelel-e a beállított feltételeknek (fájlméret, képméret pixelben, felbontás, képtípus), például egy védjegybejelentéshez feltöltendő kép követelményeinek. Ha a kép nem felel meg, a program segít beállítani a megfelelő értékeket, majd elkészíti és elmenti az átalakított képet.</w:t>
       </w:r>
     </w:p>
     <w:p>
@@ -127,11 +127,170 @@
     <w:p>
       <w:pPr>
         <w:spacing w:after="0"/>
+        <w:ind w:left="360"/>
+      </w:pPr>
+      <w:r>
+        <w:rPr>
+          <w:rFonts w:ascii="Consolas" w:hAnsi="Consolas" w:eastAsia="Consolas"/>
+          <w:sz w:val="19"/>
+        </w:rPr>
+        <w:t>TrademarkImage.exe --lang en</w:t>
+      </w:r>
+    </w:p>
+    <w:p>
+      <w:pPr>
+        <w:spacing w:after="0"/>
+        <w:ind w:left="360"/>
+      </w:pPr>
+      <w:r>
+        <w:rPr>
+          <w:rFonts w:ascii="Consolas" w:hAnsi="Consolas" w:eastAsia="Consolas"/>
+          <w:sz w:val="19"/>
+        </w:rPr>
+        <w:t>TrademarkImage.exe --locals sajat_szovegek.json</w:t>
+      </w:r>
+    </w:p>
+    <w:p>
+      <w:pPr>
+        <w:spacing w:after="0"/>
       </w:pPr>
     </w:p>
+    <w:tbl>
+      <w:tblPr>
+        <w:tblStyle w:val="TableGrid"/>
+        <w:tblW w:type="auto" w:w="0"/>
+        <w:tblLayout w:type="fixed"/>
+        <w:tblLook w:firstColumn="1" w:firstRow="1" w:lastColumn="0" w:lastRow="0" w:noHBand="0" w:noVBand="1" w:val="04A0"/>
+      </w:tblPr>
+      <w:tblGrid>
+        <w:gridCol w:w="2200"/>
+        <w:gridCol w:w="7200"/>
+      </w:tblGrid>
+      <w:tr>
+        <w:tc>
+          <w:tcPr>
+            <w:tcW w:type="dxa" w:w="2200"/>
+            <w:shd w:val="clear" w:color="auto" w:fill="D9E2F3"/>
+          </w:tcPr>
+          <w:p>
+            <w:r/>
+            <w:r>
+              <w:rPr>
+                <w:b/>
+              </w:rPr>
+              <w:t>Paraméter</w:t>
+            </w:r>
+          </w:p>
+        </w:tc>
+        <w:tc>
+          <w:tcPr>
+            <w:tcW w:type="dxa" w:w="7200"/>
+            <w:shd w:val="clear" w:color="auto" w:fill="D9E2F3"/>
+          </w:tcPr>
+          <w:p>
+            <w:r/>
+            <w:r>
+              <w:rPr>
+                <w:b/>
+              </w:rPr>
+              <w:t>Jelentése</w:t>
+            </w:r>
+          </w:p>
+        </w:tc>
+      </w:tr>
+      <w:tr>
+        <w:tc>
+          <w:tcPr>
+            <w:tcW w:type="dxa" w:w="2200"/>
+          </w:tcPr>
+          <w:p>
+            <w:r>
+              <w:t>--config FÁJL</w:t>
+            </w:r>
+          </w:p>
+        </w:tc>
+        <w:tc>
+          <w:tcPr>
+            <w:tcW w:type="dxa" w:w="7200"/>
+          </w:tcPr>
+          <w:p>
+            <w:r>
+              <w:t>A feltételeket tartalmazó JSON fájl (alapértelmezés: criterias.json az indítási könyvtárban).</w:t>
+            </w:r>
+          </w:p>
+        </w:tc>
+      </w:tr>
+      <w:tr>
+        <w:tc>
+          <w:tcPr>
+            <w:tcW w:type="dxa" w:w="2200"/>
+          </w:tcPr>
+          <w:p>
+            <w:r>
+              <w:t>--lang KÓD</w:t>
+            </w:r>
+          </w:p>
+        </w:tc>
+        <w:tc>
+          <w:tcPr>
+            <w:tcW w:type="dxa" w:w="7200"/>
+          </w:tcPr>
+          <w:p>
+            <w:r>
+              <w:t>A felület nyelve: hu (magyar) vagy en (angol), illetve bármely további, a locals.json-ba felvett nyelv kódja.</w:t>
+            </w:r>
+          </w:p>
+        </w:tc>
+      </w:tr>
+      <w:tr>
+        <w:tc>
+          <w:tcPr>
+            <w:tcW w:type="dxa" w:w="2200"/>
+          </w:tcPr>
+          <w:p>
+            <w:r>
+              <w:t>--locals FÁJL</w:t>
+            </w:r>
+          </w:p>
+        </w:tc>
+        <w:tc>
+          <w:tcPr>
+            <w:tcW w:type="dxa" w:w="7200"/>
+          </w:tcPr>
+          <w:p>
+            <w:r>
+              <w:t>Saját szövegfájl (alapértelmezés: locals.json az indítási könyvtárban, ha van).</w:t>
+            </w:r>
+          </w:p>
+        </w:tc>
+      </w:tr>
+      <w:tr>
+        <w:tc>
+          <w:tcPr>
+            <w:tcW w:type="dxa" w:w="2200"/>
+          </w:tcPr>
+          <w:p>
+            <w:r>
+              <w:t>KÉP</w:t>
+            </w:r>
+          </w:p>
+        </w:tc>
+        <w:tc>
+          <w:tcPr>
+            <w:tcW w:type="dxa" w:w="7200"/>
+          </w:tcPr>
+          <w:p>
+            <w:r>
+              <w:t>Induláskor megnyitandó képfájl.</w:t>
+            </w:r>
+          </w:p>
+        </w:tc>
+      </w:tr>
+    </w:tbl>
+    <w:p/>
     <w:p>
       <w:r>
-        <w:t>Ha az indítási könyvtárban van criterias.json nevű fájl, a program induláskor abból tölti be a feltételeket. A --config paraméterrel más fájl is megadható. Ha nincs ilyen fájl, a program az alapértelmezett feltételekkel dolgozik.</w:t>
+        <w:t>Ha az indítási könyvtárban van criterias.json nevű fájl, a program induláskor abból tölti be a feltételeket. Ha nincs ilyen fájl, az alapértelmezett feltételekkel dolgozik.</w:t>
       </w:r>
     </w:p>
     <w:p>
@@ -192,7 +351,7 @@
           </w:tcPr>
           <w:p>
             <w:r>
-              <w:t>Criteria (bal oldal)</w:t>
+              <w:t>Nyelv (jobb felső sarok)</w:t>
             </w:r>
           </w:p>
         </w:tc>
@@ -202,7 +361,29 @@
           </w:tcPr>
           <w:p>
             <w:r>
-              <w:t>A feltételek beállítása, az Apply (alkalmaz), Load criteria... (betöltés) és Save criteria as... (mentés másként) gombok. Alul látható, melyik fájlból származnak a feltételek.</w:t>
+              <w:t>A felület nyelvének kiválasztása (Magyar / English).</w:t>
+            </w:r>
+          </w:p>
+        </w:tc>
+      </w:tr>
+      <w:tr>
+        <w:tc>
+          <w:tcPr>
+            <w:tcW w:type="dxa" w:w="2600"/>
+          </w:tcPr>
+          <w:p>
+            <w:r>
+              <w:t>Feltételek (bal oldal)</w:t>
+            </w:r>
+          </w:p>
+        </w:tc>
+        <w:tc>
+          <w:tcPr>
+            <w:tcW w:type="dxa" w:w="6800"/>
+          </w:tcPr>
+          <w:p>
+            <w:r>
+              <w:t>A feltételek beállítása, valamint az Alkalmaz, a Feltételek betöltése... és a Feltételek mentése másként... gomb. Alul látható, melyik fájlból származnak a feltételek.</w:t>
             </w:r>
           </w:p>
         </w:tc>
@@ -246,7 +427,7 @@
           </w:tcPr>
           <w:p>
             <w:r>
-              <w:t>Fájlnév, formátum, mód, méret pixelben, felbontás (DPI), fájlméret.</w:t>
+              <w:t>Fájl, formátum, mód, méret pixelben, felbontás (DPI), fájlméret.</w:t>
             </w:r>
           </w:p>
         </w:tc>
@@ -268,7 +449,7 @@
           </w:tcPr>
           <w:p>
             <w:r>
-              <w:t>Zöld OK gomb vagy a nem teljesülő feltételek piros gombjai és a Convert and save... (átalakítás és mentés) gomb.</w:t>
+              <w:t>Zöld OK gomb, vagy a nem teljesülő feltételek piros gombjai és az Átalakítás és mentés... gomb.</w:t>
             </w:r>
           </w:p>
         </w:tc>
@@ -280,20 +461,190 @@
         <w:pStyle w:val="Heading1"/>
       </w:pPr>
       <w:r>
-        <w:t>4. Kép betöltése</w:t>
+        <w:t>4. A felület nyelve</w:t>
+      </w:r>
+    </w:p>
+    <w:p>
+      <w:r>
+        <w:t>A program alapértelmezés szerint magyarul indul. A nyelv a főablak jobb felső sarkában, a Nyelv listában bármikor átváltható; ilyenkor a betöltött kép és a már beállított értékek megmaradnak. A választás csak az adott futásra érvényes. Ha a program mindig más nyelven induljon, használja a --lang paramétert, vagy írja át a locals.json fájlban a "default_language" értékét (pl. "en").</w:t>
+      </w:r>
+    </w:p>
+    <w:p>
+      <w:pPr>
+        <w:pStyle w:val="Heading2"/>
+      </w:pPr>
+      <w:r>
+        <w:t>4.1 Szövegek módosítása, új nyelv felvétele</w:t>
+      </w:r>
+    </w:p>
+    <w:p>
+      <w:r>
+        <w:t>A program összes szövege a locals.json fájlban van, amely az exe mellett található, és Jegyzettömbbel szerkeszthető (UTF-8 kódolással mentse). Felépítése:</w:t>
+      </w:r>
+    </w:p>
+    <w:p>
+      <w:pPr>
+        <w:spacing w:after="0"/>
+        <w:ind w:left="360"/>
+      </w:pPr>
+      <w:r>
+        <w:rPr>
+          <w:rFonts w:ascii="Consolas" w:hAnsi="Consolas" w:eastAsia="Consolas"/>
+          <w:sz w:val="19"/>
+        </w:rPr>
+        <w:t>{</w:t>
+      </w:r>
+    </w:p>
+    <w:p>
+      <w:pPr>
+        <w:spacing w:after="0"/>
+        <w:ind w:left="360"/>
+      </w:pPr>
+      <w:r>
+        <w:rPr>
+          <w:rFonts w:ascii="Consolas" w:hAnsi="Consolas" w:eastAsia="Consolas"/>
+          <w:sz w:val="19"/>
+        </w:rPr>
+        <w:t xml:space="preserve">  "default_language": "hu",</w:t>
+      </w:r>
+    </w:p>
+    <w:p>
+      <w:pPr>
+        <w:spacing w:after="0"/>
+        <w:ind w:left="360"/>
+      </w:pPr>
+      <w:r>
+        <w:rPr>
+          <w:rFonts w:ascii="Consolas" w:hAnsi="Consolas" w:eastAsia="Consolas"/>
+          <w:sz w:val="19"/>
+        </w:rPr>
+        <w:t xml:space="preserve">  "languages": {</w:t>
+      </w:r>
+    </w:p>
+    <w:p>
+      <w:pPr>
+        <w:spacing w:after="0"/>
+        <w:ind w:left="360"/>
+      </w:pPr>
+      <w:r>
+        <w:rPr>
+          <w:rFonts w:ascii="Consolas" w:hAnsi="Consolas" w:eastAsia="Consolas"/>
+          <w:sz w:val="19"/>
+        </w:rPr>
+        <w:t xml:space="preserve">    "hu": { "language_name": "Magyar",  "prop.width": "Szélesség", ... },</w:t>
+      </w:r>
+    </w:p>
+    <w:p>
+      <w:pPr>
+        <w:spacing w:after="0"/>
+        <w:ind w:left="360"/>
+      </w:pPr>
+      <w:r>
+        <w:rPr>
+          <w:rFonts w:ascii="Consolas" w:hAnsi="Consolas" w:eastAsia="Consolas"/>
+          <w:sz w:val="19"/>
+        </w:rPr>
+        <w:t xml:space="preserve">    "en": { "language_name": "English", "prop.width": "Width", ... }</w:t>
+      </w:r>
+    </w:p>
+    <w:p>
+      <w:pPr>
+        <w:spacing w:after="0"/>
+        <w:ind w:left="360"/>
+      </w:pPr>
+      <w:r>
+        <w:rPr>
+          <w:rFonts w:ascii="Consolas" w:hAnsi="Consolas" w:eastAsia="Consolas"/>
+          <w:sz w:val="19"/>
+        </w:rPr>
+        <w:t xml:space="preserve">  }</w:t>
+      </w:r>
+    </w:p>
+    <w:p>
+      <w:pPr>
+        <w:spacing w:after="0"/>
+        <w:ind w:left="360"/>
+      </w:pPr>
+      <w:r>
+        <w:rPr>
+          <w:rFonts w:ascii="Consolas" w:hAnsi="Consolas" w:eastAsia="Consolas"/>
+          <w:sz w:val="19"/>
+        </w:rPr>
+        <w:t>}</w:t>
+      </w:r>
+    </w:p>
+    <w:p>
+      <w:pPr>
+        <w:spacing w:after="0"/>
+      </w:pPr>
+    </w:p>
+    <w:p>
+      <w:pPr>
+        <w:pStyle w:val="ListBullet"/>
+      </w:pPr>
+      <w:r>
+        <w:t>Egy szöveg módosításához írja át az idézőjelek közötti értéket a kettőspont után. A kulcsot (a kettőspont előtti részt) ne változtassa meg.</w:t>
+      </w:r>
+    </w:p>
+    <w:p>
+      <w:pPr>
+        <w:pStyle w:val="ListBullet"/>
+      </w:pPr>
+      <w:r>
+        <w:t>A kapcsos zárójelben lévő részeket (pl. {value}, {path}) a program tölti ki - ezeket változatlanul hagyja meg. A \n új sort jelent.</w:t>
+      </w:r>
+    </w:p>
+    <w:p>
+      <w:pPr>
+        <w:pStyle w:val="ListBullet"/>
+      </w:pPr>
+      <w:r>
+        <w:t>Új nyelv felvétele: másolja le az "en" blokkot, adjon neki új kódot (pl. "de"), írja át a "language_name" értékét (pl. "Deutsch"), majd fordítsa le a szövegeket. A program következő indításakor az új nyelv megjelenik a Nyelv listában.</w:t>
+      </w:r>
+    </w:p>
+    <w:p>
+      <w:pPr>
+        <w:pStyle w:val="ListBullet"/>
+      </w:pPr>
+      <w:r>
+        <w:t>Ha egy szöveg hiányzik egy nyelvből, a program az angol szöveget mutatja. Hibás fájl esetén figyelmeztetést ad, és a beépített szövegekkel dolgozik.</w:t>
+      </w:r>
+    </w:p>
+    <w:p>
+      <w:pPr>
+        <w:pStyle w:val="ListBullet"/>
+      </w:pPr>
+      <w:r>
+        <w:t>Elég csak a megváltoztatott szövegeket tartalmazó fájlt az exe mellé tenni: a program a beépített szövegekhez hozzáadja, illetve azokat felülírja vele.</w:t>
+      </w:r>
+    </w:p>
+    <w:p>
+      <w:pPr>
+        <w:pStyle w:val="Heading1"/>
+      </w:pPr>
+      <w:r>
+        <w:t>5. Kép betöltése</w:t>
       </w:r>
     </w:p>
     <w:p>
       <w:pPr>
         <w:pStyle w:val="ListNumber"/>
+        <w:numPr>
+          <w:ilvl w:val="0"/>
+          <w:numId w:val="10"/>
+        </w:numPr>
       </w:pPr>
       <w:r>
-        <w:t>Húzza a képfájlt a Windows Intézőből a „Drag and drop an image here” feliratú területre, vagy</w:t>
+        <w:t>Húzza a képfájlt a Windows Intézőből a „Húzzon ide egy képet” feliratú területre, vagy</w:t>
       </w:r>
     </w:p>
     <w:p>
       <w:pPr>
         <w:pStyle w:val="ListNumber"/>
+        <w:numPr>
+          <w:ilvl w:val="0"/>
+          <w:numId w:val="10"/>
+        </w:numPr>
       </w:pPr>
       <w:r>
         <w:t>kattintson a területre, és válassza ki a képet a megnyíló ablakban.</w:t>
@@ -309,7 +660,7 @@
         <w:pStyle w:val="Heading1"/>
       </w:pPr>
       <w:r>
-        <w:t>5. Az ellenőrzés eredménye</w:t>
+        <w:t>6. Az ellenőrzés eredménye</w:t>
       </w:r>
     </w:p>
     <w:p>
@@ -317,12 +668,12 @@
         <w:pStyle w:val="Heading2"/>
       </w:pPr>
       <w:r>
-        <w:t>5.1 A kép megfelel</w:t>
+        <w:t>6.1 A kép megfelel</w:t>
       </w:r>
     </w:p>
     <w:p>
       <w:r>
-        <w:t>Ha minden feltétel teljesül, egy zöld gomb jelenik meg: „OK - the image meets all criteria (click to exit)”. Erre kattintva a program bezárul, a képen nem változtat semmit.</w:t>
+        <w:t>Ha minden feltétel teljesül, egy zöld gomb jelenik meg: „OK - a kép minden feltételnek megfelel (kattintson a kilépéshez)”. Erre kattintva a program bezárul, a képen nem változtat semmit.</w:t>
       </w:r>
     </w:p>
     <w:p>
@@ -330,188 +681,41 @@
         <w:pStyle w:val="Heading2"/>
       </w:pPr>
       <w:r>
-        <w:t>5.2 A kép nem felel meg</w:t>
+        <w:t>6.2 A kép nem felel meg</w:t>
       </w:r>
     </w:p>
     <w:p>
       <w:r>
-        <w:t>Minden nem teljesülő feltételhez egy piros gomb tartozik, amelyen a feltétel neve, a kép jelenlegi értéke és zárójelben a követelmény olvasható, például: „Width: 4000 px (945-2835 px)”.</w:t>
+        <w:t>Minden nem teljesülő feltételhez egy piros gomb tartozik, amelyen a feltétel neve, a kép jelenlegi értéke és zárójelben a követelmény olvasható, például: „Szélesség: 4000 px (945-2835 px)”. A lehetséges gombok: Fájlméret, Szélesség, Magasság, Felbontás és Képtípus. A felbontásnál „nincs megadva” látható, ha a fájl nem tárol DPI értéket.</w:t>
       </w:r>
     </w:p>
-    <w:tbl>
-      <w:tblPr>
-        <w:tblStyle w:val="TableGrid"/>
-        <w:tblW w:type="auto" w:w="0"/>
-        <w:tblLayout w:type="fixed"/>
-        <w:tblLook w:firstColumn="1" w:firstRow="1" w:lastColumn="0" w:lastRow="0" w:noHBand="0" w:noVBand="1" w:val="04A0"/>
-      </w:tblPr>
-      <w:tblGrid>
-        <w:gridCol w:w="2600"/>
-        <w:gridCol w:w="6800"/>
-      </w:tblGrid>
-      <w:tr>
-        <w:tc>
-          <w:tcPr>
-            <w:tcW w:type="dxa" w:w="2600"/>
-            <w:shd w:val="clear" w:color="auto" w:fill="D9E2F3"/>
-          </w:tcPr>
-          <w:p>
-            <w:r/>
-            <w:r>
-              <w:rPr>
-                <w:b/>
-              </w:rPr>
-              <w:t>Gomb felirata</w:t>
-            </w:r>
-          </w:p>
-        </w:tc>
-        <w:tc>
-          <w:tcPr>
-            <w:tcW w:type="dxa" w:w="6800"/>
-            <w:shd w:val="clear" w:color="auto" w:fill="D9E2F3"/>
-          </w:tcPr>
-          <w:p>
-            <w:r/>
-            <w:r>
-              <w:rPr>
-                <w:b/>
-              </w:rPr>
-              <w:t>Jelentése</w:t>
-            </w:r>
-          </w:p>
-        </w:tc>
-      </w:tr>
-      <w:tr>
-        <w:tc>
-          <w:tcPr>
-            <w:tcW w:type="dxa" w:w="2600"/>
-          </w:tcPr>
-          <w:p>
-            <w:r>
-              <w:t>File size</w:t>
-            </w:r>
-          </w:p>
-        </w:tc>
-        <w:tc>
-          <w:tcPr>
-            <w:tcW w:type="dxa" w:w="6800"/>
-          </w:tcPr>
-          <w:p>
-            <w:r>
-              <w:t>Fájlméret (MB)</w:t>
-            </w:r>
-          </w:p>
-        </w:tc>
-      </w:tr>
-      <w:tr>
-        <w:tc>
-          <w:tcPr>
-            <w:tcW w:type="dxa" w:w="2600"/>
-          </w:tcPr>
-          <w:p>
-            <w:r>
-              <w:t>Width</w:t>
-            </w:r>
-          </w:p>
-        </w:tc>
-        <w:tc>
-          <w:tcPr>
-            <w:tcW w:type="dxa" w:w="6800"/>
-          </w:tcPr>
-          <w:p>
-            <w:r>
-              <w:t>Szélesség (pixel)</w:t>
-            </w:r>
-          </w:p>
-        </w:tc>
-      </w:tr>
-      <w:tr>
-        <w:tc>
-          <w:tcPr>
-            <w:tcW w:type="dxa" w:w="2600"/>
-          </w:tcPr>
-          <w:p>
-            <w:r>
-              <w:t>Height</w:t>
-            </w:r>
-          </w:p>
-        </w:tc>
-        <w:tc>
-          <w:tcPr>
-            <w:tcW w:type="dxa" w:w="6800"/>
-          </w:tcPr>
-          <w:p>
-            <w:r>
-              <w:t>Magasság (pixel)</w:t>
-            </w:r>
-          </w:p>
-        </w:tc>
-      </w:tr>
-      <w:tr>
-        <w:tc>
-          <w:tcPr>
-            <w:tcW w:type="dxa" w:w="2600"/>
-          </w:tcPr>
-          <w:p>
-            <w:r>
-              <w:t>Resolution</w:t>
-            </w:r>
-          </w:p>
-        </w:tc>
-        <w:tc>
-          <w:tcPr>
-            <w:tcW w:type="dxa" w:w="6800"/>
-          </w:tcPr>
-          <w:p>
-            <w:r>
-              <w:t>Felbontás (DPI); „not set”, ha a fájl nem tartalmaz felbontást</w:t>
-            </w:r>
-          </w:p>
-        </w:tc>
-      </w:tr>
-      <w:tr>
-        <w:tc>
-          <w:tcPr>
-            <w:tcW w:type="dxa" w:w="2600"/>
-          </w:tcPr>
-          <w:p>
-            <w:r>
-              <w:t>Image type</w:t>
-            </w:r>
-          </w:p>
-        </w:tc>
-        <w:tc>
-          <w:tcPr>
-            <w:tcW w:type="dxa" w:w="6800"/>
-          </w:tcPr>
-          <w:p>
-            <w:r>
-              <w:t>Képtípus (színmód)</w:t>
-            </w:r>
-          </w:p>
-        </w:tc>
-      </w:tr>
-    </w:tbl>
-    <w:p/>
     <w:p>
       <w:pPr>
         <w:pStyle w:val="Heading1"/>
       </w:pPr>
       <w:r>
-        <w:t>6. A hibás értékek javítása</w:t>
+        <w:t>7. A hibás értékek javítása</w:t>
       </w:r>
     </w:p>
     <w:p>
       <w:pPr>
         <w:pStyle w:val="ListNumber"/>
+        <w:numPr>
+          <w:ilvl w:val="0"/>
+          <w:numId w:val="11"/>
+        </w:numPr>
       </w:pPr>
       <w:r>
-        <w:t>Kattintson egy piros gombra. Megnyílik egy ablak, amely mutatja a jelenlegi értéket és a követelményt, az új érték mezője pedig egy megfelelő javaslattal van kitöltve.</w:t>
+        <w:t>Kattintson egy piros gombra. Megnyílik egy ablak, amely mutatja a jelenlegi értéket és a követelményt, az Új érték mező pedig egy megfelelő javaslattal van kitöltve.</w:t>
       </w:r>
     </w:p>
     <w:p>
       <w:pPr>
         <w:pStyle w:val="ListNumber"/>
+        <w:numPr>
+          <w:ilvl w:val="0"/>
+          <w:numId w:val="11"/>
+        </w:numPr>
       </w:pPr>
       <w:r>
         <w:t>Írja be (vagy fogadja el) a kívánt értéket, és nyomja meg az OK gombot.</w:t>
@@ -520,9 +724,13 @@
     <w:p>
       <w:pPr>
         <w:pStyle w:val="ListNumber"/>
+        <w:numPr>
+          <w:ilvl w:val="0"/>
+          <w:numId w:val="11"/>
+        </w:numPr>
       </w:pPr>
       <w:r>
-        <w:t>Ha az érték megfelel a feltételnek, a gomb fehér lesz, és az új értéket mutatja (pl. „Width: 4000 px -&gt; 2800 px”). Ha nem felel meg, hibaüzenet jelenik meg, és az ablak nyitva marad. A Cancel gombbal a változtatás elvethető, a gomb piros marad.</w:t>
+        <w:t>Ha az érték megfelel a feltételnek, a gomb fehér lesz, és az új értéket mutatja (pl. „Szélesség: 4000 px -&gt; 2800 px”). Ha nem felel meg, hibaüzenet jelenik meg, és az ablak nyitva marad. A Mégse gombbal a változtatás elvethető, a gomb piros marad.</w:t>
       </w:r>
     </w:p>
     <w:p>
@@ -536,7 +744,7 @@
         <w:t xml:space="preserve">Szélesség, magasság: </w:t>
       </w:r>
       <w:r>
-        <w:t>a „Keep aspect ratio” jelölőnégyzet bekapcsolva (alapértelmezés) a másik méretet is arányosan módosítja, így a kép nem torzul. Ha emiatt a másik méret kerül a megengedett tartományon kívülre, arra is megjelenik egy piros gomb. A felajánlott értékek - ha lehetséges - megtartják a képarányt.</w:t>
+        <w:t>a „Méretarány megtartása” jelölőnégyzet bekapcsolva (alapértelmezés) a másik méretet is arányosan módosítja, így a kép nem torzul. Ha emiatt a másik méret kerül a megengedett tartományon kívülre, arra is megjelenik egy piros gomb. A felajánlott értékek - ha lehetséges - megtartják a képarányt.</w:t>
       </w:r>
     </w:p>
     <w:p>
@@ -586,12 +794,12 @@
         <w:pStyle w:val="Heading1"/>
       </w:pPr>
       <w:r>
-        <w:t>7. Átalakítás és mentés</w:t>
+        <w:t>8. Átalakítás és mentés</w:t>
       </w:r>
     </w:p>
     <w:p>
       <w:r>
-        <w:t>Amikor az utolsó piros gomb is fehér lesz, a program automatikusan megnyitja a mentési ablakot. Ha ezt megszakítja, később a „Convert and save...” gombbal indíthatja újra.</w:t>
+        <w:t>Amikor az utolsó piros gomb is fehér lesz, a program automatikusan megnyitja a mentési ablakot. Ha ezt megszakítja, később az „Átalakítás és mentés...” gombbal indíthatja újra.</w:t>
       </w:r>
     </w:p>
     <w:p>
@@ -599,7 +807,7 @@
         <w:pStyle w:val="ListBullet"/>
       </w:pPr>
       <w:r>
-        <w:t>Az alapértelmezett formátum az eredeti fájl formátuma (ha az a választott képtípust tárolni tudja), az alapértelmezett fájlnév „&lt;eredeti név&gt;_converted”.</w:t>
+        <w:t>Az alapértelmezett formátum az eredeti fájl formátuma (ha az a választott képtípust tárolni tudja), az alapértelmezett fájlnév „&lt;eredeti név&gt;_atalakitott”.</w:t>
       </w:r>
     </w:p>
     <w:p>
@@ -702,7 +910,7 @@
           </w:tcPr>
           <w:p>
             <w:r>
-              <w:t>RGB, greyscale, CMYK</w:t>
+              <w:t>RGB, szürkeárnyalatos, CMYK</w:t>
             </w:r>
           </w:p>
         </w:tc>
@@ -734,7 +942,7 @@
           </w:tcPr>
           <w:p>
             <w:r>
-              <w:t>RGB, RGBA, greyscale, B&amp;W, palette</w:t>
+              <w:t>RGB, RGBA, szürkeárnyalatos, fekete-fehér, palettás</w:t>
             </w:r>
           </w:p>
         </w:tc>
@@ -798,7 +1006,7 @@
           </w:tcPr>
           <w:p>
             <w:r>
-              <w:t>RGB, greyscale, B&amp;W, palette</w:t>
+              <w:t>RGB, szürkeárnyalatos, fekete-fehér, palettás</w:t>
             </w:r>
           </w:p>
         </w:tc>
@@ -817,7 +1025,7 @@
     <w:p/>
     <w:p>
       <w:r>
-        <w:t>Átalakításkor az átlátszó részek fehér hátteret kapnak (kivéve RGBA típus esetén), a fekete-fehér (B&amp;W) átalakítás 50%-os küszöbbel történik, a kép pedig a fényképezőgép által tárolt tájolás szerint elforgatásra kerül.</w:t>
+        <w:t>Átalakításkor az átlátszó részek fehér hátteret kapnak (kivéve RGBA típus esetén), a fekete-fehér átalakítás 50%-os küszöbbel történik, a kép pedig a fényképezőgép által tárolt tájolás szerint elforgatásra kerül.</w:t>
       </w:r>
     </w:p>
     <w:p>
@@ -825,7 +1033,7 @@
         <w:pStyle w:val="Heading1"/>
       </w:pPr>
       <w:r>
-        <w:t>8. A feltételek beállítása</w:t>
+        <w:t>9. A feltételek beállítása</w:t>
       </w:r>
     </w:p>
     <w:tbl>
@@ -836,14 +1044,14 @@
         <w:tblLook w:firstColumn="1" w:firstRow="1" w:lastColumn="0" w:lastRow="0" w:noHBand="0" w:noVBand="1" w:val="04A0"/>
       </w:tblPr>
       <w:tblGrid>
-        <w:gridCol w:w="2800"/>
-        <w:gridCol w:w="4400"/>
-        <w:gridCol w:w="2200"/>
+        <w:gridCol w:w="3000"/>
+        <w:gridCol w:w="2600"/>
+        <w:gridCol w:w="3800"/>
       </w:tblGrid>
       <w:tr>
         <w:tc>
           <w:tcPr>
-            <w:tcW w:type="dxa" w:w="2800"/>
+            <w:tcW w:type="dxa" w:w="3000"/>
             <w:shd w:val="clear" w:color="auto" w:fill="D9E2F3"/>
           </w:tcPr>
           <w:p>
@@ -858,7 +1066,7 @@
         </w:tc>
         <w:tc>
           <w:tcPr>
-            <w:tcW w:type="dxa" w:w="4400"/>
+            <w:tcW w:type="dxa" w:w="2600"/>
             <w:shd w:val="clear" w:color="auto" w:fill="D9E2F3"/>
           </w:tcPr>
           <w:p>
@@ -867,13 +1075,13 @@
               <w:rPr>
                 <w:b/>
               </w:rPr>
-              <w:t>Jelentés</w:t>
+              <w:t>Kulcs a JSON fájlban</w:t>
             </w:r>
           </w:p>
         </w:tc>
         <w:tc>
           <w:tcPr>
-            <w:tcW w:type="dxa" w:w="2200"/>
+            <w:tcW w:type="dxa" w:w="3800"/>
             <w:shd w:val="clear" w:color="auto" w:fill="D9E2F3"/>
           </w:tcPr>
           <w:p>
@@ -890,31 +1098,31 @@
       <w:tr>
         <w:tc>
           <w:tcPr>
-            <w:tcW w:type="dxa" w:w="2800"/>
+            <w:tcW w:type="dxa" w:w="3000"/>
           </w:tcPr>
           <w:p>
             <w:r>
-              <w:t>Maximum file size (MB)</w:t>
+              <w:t>Legnagyobb fájlméret (MB)</w:t>
             </w:r>
           </w:p>
         </w:tc>
         <w:tc>
           <w:tcPr>
-            <w:tcW w:type="dxa" w:w="4400"/>
+            <w:tcW w:type="dxa" w:w="2600"/>
           </w:tcPr>
           <w:p>
             <w:r>
-              <w:t>Legnagyobb fájlméret (1 MB = 1 048 576 bájt)</w:t>
+              <w:t>max_file_size_mb</w:t>
             </w:r>
           </w:p>
         </w:tc>
         <w:tc>
           <w:tcPr>
-            <w:tcW w:type="dxa" w:w="2200"/>
+            <w:tcW w:type="dxa" w:w="3800"/>
           </w:tcPr>
           <w:p>
             <w:r>
-              <w:t>2</w:t>
+              <w:t>2 (1 MB = 1 048 576 bájt)</w:t>
             </w:r>
           </w:p>
         </w:tc>
@@ -922,27 +1130,27 @@
       <w:tr>
         <w:tc>
           <w:tcPr>
-            <w:tcW w:type="dxa" w:w="2800"/>
+            <w:tcW w:type="dxa" w:w="3000"/>
           </w:tcPr>
           <w:p>
             <w:r>
-              <w:t>Minimum width (px)</w:t>
+              <w:t>Legkisebb szélesség (px)</w:t>
             </w:r>
           </w:p>
         </w:tc>
         <w:tc>
           <w:tcPr>
-            <w:tcW w:type="dxa" w:w="4400"/>
+            <w:tcW w:type="dxa" w:w="2600"/>
           </w:tcPr>
           <w:p>
             <w:r>
-              <w:t>Legkisebb szélesség</w:t>
+              <w:t>min_width</w:t>
             </w:r>
           </w:p>
         </w:tc>
         <w:tc>
           <w:tcPr>
-            <w:tcW w:type="dxa" w:w="2200"/>
+            <w:tcW w:type="dxa" w:w="3800"/>
           </w:tcPr>
           <w:p>
             <w:r>
@@ -954,27 +1162,27 @@
       <w:tr>
         <w:tc>
           <w:tcPr>
-            <w:tcW w:type="dxa" w:w="2800"/>
+            <w:tcW w:type="dxa" w:w="3000"/>
           </w:tcPr>
           <w:p>
             <w:r>
-              <w:t>Minimum height (px)</w:t>
+              <w:t>Legkisebb magasság (px)</w:t>
             </w:r>
           </w:p>
         </w:tc>
         <w:tc>
           <w:tcPr>
-            <w:tcW w:type="dxa" w:w="4400"/>
+            <w:tcW w:type="dxa" w:w="2600"/>
           </w:tcPr>
           <w:p>
             <w:r>
-              <w:t>Legkisebb magasság</w:t>
+              <w:t>min_height</w:t>
             </w:r>
           </w:p>
         </w:tc>
         <w:tc>
           <w:tcPr>
-            <w:tcW w:type="dxa" w:w="2200"/>
+            <w:tcW w:type="dxa" w:w="3800"/>
           </w:tcPr>
           <w:p>
             <w:r>
@@ -986,27 +1194,27 @@
       <w:tr>
         <w:tc>
           <w:tcPr>
-            <w:tcW w:type="dxa" w:w="2800"/>
+            <w:tcW w:type="dxa" w:w="3000"/>
           </w:tcPr>
           <w:p>
             <w:r>
-              <w:t>Maximum width (px)</w:t>
+              <w:t>Legnagyobb szélesség (px)</w:t>
             </w:r>
           </w:p>
         </w:tc>
         <w:tc>
           <w:tcPr>
-            <w:tcW w:type="dxa" w:w="4400"/>
+            <w:tcW w:type="dxa" w:w="2600"/>
           </w:tcPr>
           <w:p>
             <w:r>
-              <w:t>Legnagyobb szélesség</w:t>
+              <w:t>max_width</w:t>
             </w:r>
           </w:p>
         </w:tc>
         <w:tc>
           <w:tcPr>
-            <w:tcW w:type="dxa" w:w="2200"/>
+            <w:tcW w:type="dxa" w:w="3800"/>
           </w:tcPr>
           <w:p>
             <w:r>
@@ -1018,27 +1226,27 @@
       <w:tr>
         <w:tc>
           <w:tcPr>
-            <w:tcW w:type="dxa" w:w="2800"/>
+            <w:tcW w:type="dxa" w:w="3000"/>
           </w:tcPr>
           <w:p>
             <w:r>
-              <w:t>Maximum height (px)</w:t>
+              <w:t>Legnagyobb magasság (px)</w:t>
             </w:r>
           </w:p>
         </w:tc>
         <w:tc>
           <w:tcPr>
-            <w:tcW w:type="dxa" w:w="4400"/>
+            <w:tcW w:type="dxa" w:w="2600"/>
           </w:tcPr>
           <w:p>
             <w:r>
-              <w:t>Legnagyobb magasság</w:t>
+              <w:t>max_height</w:t>
             </w:r>
           </w:p>
         </w:tc>
         <w:tc>
           <w:tcPr>
-            <w:tcW w:type="dxa" w:w="2200"/>
+            <w:tcW w:type="dxa" w:w="3800"/>
           </w:tcPr>
           <w:p>
             <w:r>
@@ -1050,27 +1258,27 @@
       <w:tr>
         <w:tc>
           <w:tcPr>
-            <w:tcW w:type="dxa" w:w="2800"/>
+            <w:tcW w:type="dxa" w:w="3000"/>
           </w:tcPr>
           <w:p>
             <w:r>
-              <w:t>Minimum resolution (DPI)</w:t>
+              <w:t>Legkisebb felbontás (DPI)</w:t>
             </w:r>
           </w:p>
         </w:tc>
         <w:tc>
           <w:tcPr>
-            <w:tcW w:type="dxa" w:w="4400"/>
+            <w:tcW w:type="dxa" w:w="2600"/>
           </w:tcPr>
           <w:p>
             <w:r>
-              <w:t>Legkisebb felbontás</w:t>
+              <w:t>min_dpi</w:t>
             </w:r>
           </w:p>
         </w:tc>
         <w:tc>
           <w:tcPr>
-            <w:tcW w:type="dxa" w:w="2200"/>
+            <w:tcW w:type="dxa" w:w="3800"/>
           </w:tcPr>
           <w:p>
             <w:r>
@@ -1082,17 +1290,7 @@
       <w:tr>
         <w:tc>
           <w:tcPr>
-            <w:tcW w:type="dxa" w:w="2800"/>
-          </w:tcPr>
-          <w:p>
-            <w:r>
-              <w:t>Allowed image types</w:t>
-            </w:r>
-          </w:p>
-        </w:tc>
-        <w:tc>
-          <w:tcPr>
-            <w:tcW w:type="dxa" w:w="4400"/>
+            <w:tcW w:type="dxa" w:w="3000"/>
           </w:tcPr>
           <w:p>
             <w:r>
@@ -1102,11 +1300,21 @@
         </w:tc>
         <w:tc>
           <w:tcPr>
-            <w:tcW w:type="dxa" w:w="2200"/>
+            <w:tcW w:type="dxa" w:w="2600"/>
           </w:tcPr>
           <w:p>
             <w:r>
-              <w:t>RGB, greyscale, B&amp;W, CMYK</w:t>
+              <w:t>allowed_types</w:t>
+            </w:r>
+          </w:p>
+        </w:tc>
+        <w:tc>
+          <w:tcPr>
+            <w:tcW w:type="dxa" w:w="3800"/>
+          </w:tcPr>
+          <w:p>
+            <w:r>
+              <w:t>RGB, szürkeárnyalatos, fekete-fehér, CMYK</w:t>
             </w:r>
           </w:p>
         </w:tc>
@@ -1121,10 +1329,26 @@
         <w:tblLook w:firstColumn="1" w:firstRow="1" w:lastColumn="0" w:lastRow="0" w:noHBand="0" w:noVBand="1" w:val="04A0"/>
       </w:tblPr>
       <w:tblGrid>
+        <w:gridCol w:w="3000"/>
         <w:gridCol w:w="2600"/>
-        <w:gridCol w:w="6800"/>
+        <w:gridCol w:w="3800"/>
       </w:tblGrid>
       <w:tr>
+        <w:tc>
+          <w:tcPr>
+            <w:tcW w:type="dxa" w:w="3000"/>
+            <w:shd w:val="clear" w:color="auto" w:fill="D9E2F3"/>
+          </w:tcPr>
+          <w:p>
+            <w:r/>
+            <w:r>
+              <w:rPr>
+                <w:b/>
+              </w:rPr>
+              <w:t>Képtípus a felületen</w:t>
+            </w:r>
+          </w:p>
+        </w:tc>
         <w:tc>
           <w:tcPr>
             <w:tcW w:type="dxa" w:w="2600"/>
@@ -1136,13 +1360,13 @@
               <w:rPr>
                 <w:b/>
               </w:rPr>
-              <w:t>Képtípus</w:t>
+              <w:t>Azonosító a JSON fájlban</w:t>
             </w:r>
           </w:p>
         </w:tc>
         <w:tc>
           <w:tcPr>
-            <w:tcW w:type="dxa" w:w="6800"/>
+            <w:tcW w:type="dxa" w:w="3800"/>
             <w:shd w:val="clear" w:color="auto" w:fill="D9E2F3"/>
           </w:tcPr>
           <w:p>
@@ -1159,6 +1383,16 @@
       <w:tr>
         <w:tc>
           <w:tcPr>
+            <w:tcW w:type="dxa" w:w="3000"/>
+          </w:tcPr>
+          <w:p>
+            <w:r>
+              <w:t>RGB (színes)</w:t>
+            </w:r>
+          </w:p>
+        </w:tc>
+        <w:tc>
+          <w:tcPr>
             <w:tcW w:type="dxa" w:w="2600"/>
           </w:tcPr>
           <w:p>
@@ -1169,7 +1403,7 @@
         </w:tc>
         <w:tc>
           <w:tcPr>
-            <w:tcW w:type="dxa" w:w="6800"/>
+            <w:tcW w:type="dxa" w:w="3800"/>
           </w:tcPr>
           <w:p>
             <w:r>
@@ -1179,6 +1413,16 @@
         </w:tc>
       </w:tr>
       <w:tr>
+        <w:tc>
+          <w:tcPr>
+            <w:tcW w:type="dxa" w:w="3000"/>
+          </w:tcPr>
+          <w:p>
+            <w:r>
+              <w:t>RGBA (színes, átlátszó)</w:t>
+            </w:r>
+          </w:p>
+        </w:tc>
         <w:tc>
           <w:tcPr>
             <w:tcW w:type="dxa" w:w="2600"/>
@@ -1191,7 +1435,7 @@
         </w:tc>
         <w:tc>
           <w:tcPr>
-            <w:tcW w:type="dxa" w:w="6800"/>
+            <w:tcW w:type="dxa" w:w="3800"/>
           </w:tcPr>
           <w:p>
             <w:r>
@@ -1201,6 +1445,16 @@
         </w:tc>
       </w:tr>
       <w:tr>
+        <w:tc>
+          <w:tcPr>
+            <w:tcW w:type="dxa" w:w="3000"/>
+          </w:tcPr>
+          <w:p>
+            <w:r>
+              <w:t>szürkeárnyalatos</w:t>
+            </w:r>
+          </w:p>
+        </w:tc>
         <w:tc>
           <w:tcPr>
             <w:tcW w:type="dxa" w:w="2600"/>
@@ -1213,7 +1467,7 @@
         </w:tc>
         <w:tc>
           <w:tcPr>
-            <w:tcW w:type="dxa" w:w="6800"/>
+            <w:tcW w:type="dxa" w:w="3800"/>
           </w:tcPr>
           <w:p>
             <w:r>
@@ -1223,6 +1477,16 @@
         </w:tc>
       </w:tr>
       <w:tr>
+        <w:tc>
+          <w:tcPr>
+            <w:tcW w:type="dxa" w:w="3000"/>
+          </w:tcPr>
+          <w:p>
+            <w:r>
+              <w:t>fekete-fehér</w:t>
+            </w:r>
+          </w:p>
+        </w:tc>
         <w:tc>
           <w:tcPr>
             <w:tcW w:type="dxa" w:w="2600"/>
@@ -1235,16 +1499,26 @@
         </w:tc>
         <w:tc>
           <w:tcPr>
-            <w:tcW w:type="dxa" w:w="6800"/>
+            <w:tcW w:type="dxa" w:w="3800"/>
           </w:tcPr>
           <w:p>
             <w:r>
-              <w:t>Fekete-fehér (kétszínű) kép</w:t>
+              <w:t>Kétszínű (fekete-fehér) kép</w:t>
             </w:r>
           </w:p>
         </w:tc>
       </w:tr>
       <w:tr>
+        <w:tc>
+          <w:tcPr>
+            <w:tcW w:type="dxa" w:w="3000"/>
+          </w:tcPr>
+          <w:p>
+            <w:r>
+              <w:t>CMYK</w:t>
+            </w:r>
+          </w:p>
+        </w:tc>
         <w:tc>
           <w:tcPr>
             <w:tcW w:type="dxa" w:w="2600"/>
@@ -1257,7 +1531,7 @@
         </w:tc>
         <w:tc>
           <w:tcPr>
-            <w:tcW w:type="dxa" w:w="6800"/>
+            <w:tcW w:type="dxa" w:w="3800"/>
           </w:tcPr>
           <w:p>
             <w:r>
@@ -1267,6 +1541,16 @@
         </w:tc>
       </w:tr>
       <w:tr>
+        <w:tc>
+          <w:tcPr>
+            <w:tcW w:type="dxa" w:w="3000"/>
+          </w:tcPr>
+          <w:p>
+            <w:r>
+              <w:t>palettás</w:t>
+            </w:r>
+          </w:p>
+        </w:tc>
         <w:tc>
           <w:tcPr>
             <w:tcW w:type="dxa" w:w="2600"/>
@@ -1279,11 +1563,11 @@
         </w:tc>
         <w:tc>
           <w:tcPr>
-            <w:tcW w:type="dxa" w:w="6800"/>
+            <w:tcW w:type="dxa" w:w="3800"/>
           </w:tcPr>
           <w:p>
             <w:r>
-              <w:t>Palettás (legfeljebb 256 színű) kép, pl. GIF</w:t>
+              <w:t>Legfeljebb 256 színű kép, pl. GIF</w:t>
             </w:r>
           </w:p>
         </w:tc>
@@ -1293,14 +1577,22 @@
     <w:p>
       <w:pPr>
         <w:pStyle w:val="ListNumber"/>
+        <w:numPr>
+          <w:ilvl w:val="0"/>
+          <w:numId w:val="12"/>
+        </w:numPr>
       </w:pPr>
       <w:r>
-        <w:t>Módosítsa a mezőket, majd nyomja meg az Apply gombot.</w:t>
+        <w:t>Módosítsa a mezőket, majd nyomja meg az Alkalmaz gombot.</w:t>
       </w:r>
     </w:p>
     <w:p>
       <w:pPr>
         <w:pStyle w:val="ListNumber"/>
+        <w:numPr>
+          <w:ilvl w:val="0"/>
+          <w:numId w:val="12"/>
+        </w:numPr>
       </w:pPr>
       <w:r>
         <w:t>Ha a feltételek változtak, a program megkérdezi, el akarja-e menteni őket fájlba. Igen válasz esetén a mentési ablak a jelenlegi feltételfájlt (alapesetben criterias.json) ajánlja fel.</w:t>
@@ -1309,6 +1601,10 @@
     <w:p>
       <w:pPr>
         <w:pStyle w:val="ListNumber"/>
+        <w:numPr>
+          <w:ilvl w:val="0"/>
+          <w:numId w:val="12"/>
+        </w:numPr>
       </w:pPr>
       <w:r>
         <w:t>A betöltött kép ellenőrzése az új feltételekkel automatikusan megismétlődik.</w:t>
@@ -1316,12 +1612,12 @@
     </w:p>
     <w:p>
       <w:r>
-        <w:t>Más feltételkészlet betöltése: Load criteria... gomb, majd a JSON fájl kiválasztása. Mentés tetszőleges néven: Save criteria as... gomb.</w:t>
+        <w:t>Más feltételkészlet betöltése: Feltételek betöltése... gomb, majd a JSON fájl kiválasztása. Mentés tetszőleges néven: Feltételek mentése másként... gomb.</w:t>
       </w:r>
     </w:p>
     <w:p>
       <w:r>
-        <w:t>Ha azt szeretné, hogy a program mindig a saját feltételeivel induljon, mentse őket criterias.json néven az exe mellé. A fájl egyszerű JSON szöveg, Jegyzettömbbel is szerkeszthető:</w:t>
+        <w:t>Ha azt szeretné, hogy a program mindig a saját feltételeivel induljon, mentse őket criterias.json néven az exe mellé. A fájl egyszerű JSON szöveg, Jegyzettömbbel is szerkeszthető (a képtípusokat az azonosítójukkal kell megadni):</w:t>
       </w:r>
     </w:p>
     <w:p>
@@ -1451,7 +1747,7 @@
         <w:pStyle w:val="Heading1"/>
       </w:pPr>
       <w:r>
-        <w:t>9. Gyakori kérdések és hibaüzenetek</w:t>
+        <w:t>10. Gyakori kérdések és hibaüzenetek</w:t>
       </w:r>
     </w:p>
     <w:tbl>
@@ -1504,7 +1800,7 @@
           </w:tcPr>
           <w:p>
             <w:r>
-              <w:t>Cannot open image / Not a recognised image file</w:t>
+              <w:t>A kép nem nyitható meg / Nem felismerhető képfájl</w:t>
             </w:r>
           </w:p>
         </w:tc>
@@ -1526,7 +1822,7 @@
           </w:tcPr>
           <w:p>
             <w:r>
-              <w:t>Invalid value</w:t>
+              <w:t>Érvénytelen érték</w:t>
             </w:r>
           </w:p>
         </w:tc>
@@ -1536,7 +1832,7 @@
           </w:tcPr>
           <w:p>
             <w:r>
-              <w:t>A beírt érték nem szám vagy kívül esik a megengedett tartományon.</w:t>
+              <w:t>A beírt érték nem szám, vagy kívül esik a megengedett tartományon.</w:t>
             </w:r>
           </w:p>
         </w:tc>
@@ -1548,7 +1844,7 @@
           </w:tcPr>
           <w:p>
             <w:r>
-              <w:t>Invalid criteria</w:t>
+              <w:t>Érvénytelen feltételek</w:t>
             </w:r>
           </w:p>
         </w:tc>
@@ -1558,7 +1854,7 @@
           </w:tcPr>
           <w:p>
             <w:r>
-              <w:t>A Criteria panel valamelyik mezője hibás (pl. a minimum nagyobb a maximumnál, vagy nincs megengedett képtípus).</w:t>
+              <w:t>A Feltételek panel valamelyik mezője hibás (pl. a minimum nagyobb a maximumnál, vagy nincs megengedett képtípus).</w:t>
             </w:r>
           </w:p>
         </w:tc>
@@ -1570,7 +1866,7 @@
           </w:tcPr>
           <w:p>
             <w:r>
-              <w:t>Unsuitable format</w:t>
+              <w:t>Nem megfelelő formátum</w:t>
             </w:r>
           </w:p>
         </w:tc>
@@ -1592,7 +1888,7 @@
           </w:tcPr>
           <w:p>
             <w:r>
-              <w:t>Conversion failed ... minimum size</w:t>
+              <w:t>Sikertelen átalakítás ... legkisebb megengedett méret</w:t>
             </w:r>
           </w:p>
         </w:tc>
@@ -1602,7 +1898,7 @@
           </w:tcPr>
           <w:p>
             <w:r>
-              <w:t>A kép a megadott fájlméretbe a minimális képméret alatt sem fér bele. Válasszon JPEG formátumot vagy más képtípust.</w:t>
+              <w:t>A kép a megadott fájlméretbe a minimális képméret mellett sem fér bele. Válasszon JPEG formátumot vagy más képtípust.</w:t>
             </w:r>
           </w:p>
         </w:tc>
@@ -1614,7 +1910,7 @@
           </w:tcPr>
           <w:p>
             <w:r>
-              <w:t>A felbontás „not set”</w:t>
+              <w:t>A felbontás „nincs megadva”</w:t>
             </w:r>
           </w:p>
         </w:tc>
@@ -1624,7 +1920,7 @@
           </w:tcPr>
           <w:p>
             <w:r>
-              <w:t>A fájl nem tárol DPI értéket; állítson be egyet a Resolution gombbal.</w:t>
+              <w:t>A fájl nem tárol DPI értéket; állítson be egyet a Felbontás gombbal.</w:t>
             </w:r>
           </w:p>
         </w:tc>
@@ -1636,7 +1932,7 @@
           </w:tcPr>
           <w:p>
             <w:r>
-              <w:t>Figyelmeztetés indításkor a criteria fájlról</w:t>
+              <w:t>Figyelmeztetés indításkor</w:t>
             </w:r>
           </w:p>
         </w:tc>
@@ -1646,7 +1942,29 @@
           </w:tcPr>
           <w:p>
             <w:r>
-              <w:t>A fájl hibás vagy nem található; a program az alapértelmezett feltételeket használja.</w:t>
+              <w:t>A feltételfájl vagy a locals.json hibás / nem található, vagy ismeretlen a --lang nyelvkód. A program az alapértelmezett beállításokkal fut.</w:t>
+            </w:r>
+          </w:p>
+        </w:tc>
+      </w:tr>
+      <w:tr>
+        <w:tc>
+          <w:tcPr>
+            <w:tcW w:type="dxa" w:w="3400"/>
+          </w:tcPr>
+          <w:p>
+            <w:r>
+              <w:t>Angol szöveg jelenik meg magyar felületen</w:t>
+            </w:r>
+          </w:p>
+        </w:tc>
+        <w:tc>
+          <w:tcPr>
+            <w:tcW w:type="dxa" w:w="6000"/>
+          </w:tcPr>
+          <w:p>
+            <w:r>
+              <w:t>A szöveg hiányzik a locals.json magyar részéből - pótolja a hiányzó kulcsot.</w:t>
             </w:r>
           </w:p>
         </w:tc>
@@ -1862,6 +2180,24 @@
   </w:num>
   <w:num w:numId="9">
     <w:abstractNumId w:val="0"/>
+  </w:num>
+  <w:num w:numId="10">
+    <w:abstractNumId w:val="7"/>
+    <w:lvlOverride w:ilvl="0">
+      <w:startOverride w:val="1"/>
+    </w:lvlOverride>
+  </w:num>
+  <w:num w:numId="11">
+    <w:abstractNumId w:val="7"/>
+    <w:lvlOverride w:ilvl="0">
+      <w:startOverride w:val="1"/>
+    </w:lvlOverride>
+  </w:num>
+  <w:num w:numId="12">
+    <w:abstractNumId w:val="7"/>
+    <w:lvlOverride w:ilvl="0">
+      <w:startOverride w:val="1"/>
+    </w:lvlOverride>
   </w:num>
 </w:numbering>
 </file>

</xml_diff>

<commit_message>
Reorganize user manuals into basic and advanced parts
Both the English and the Hungarian user manual now have two parts:
I. Basic usage (window, loading, checking, fixing, converting, criteria
panel, FAQ) and II. Advanced usage and customization, which now holds the
command line parameters, the language setting and locals.json, and the
criteria file structure, plus troubleshooting for these settings. Part II
starts on a new page in the Word version.

Co-Authored-By: Claude Opus 5.5 <noreply@anthropic.com>
</commit_message>
<xml_diff>
--- a/docs/TrademarkImage_Felhasznaloi_kezikonyv_HU.docx
+++ b/docs/TrademarkImage_Felhasznaloi_kezikonyv_HU.docx
@@ -28,8 +28,21 @@
       </w:r>
     </w:p>
     <w:p>
+      <w:r>
+        <w:t>A kézikönyv két részből áll. Az I. rész a program mindennapi használatát írja le. A II. rész a haladó lehetőségeket mutatja be: a parancssori paramétereket, a nyelv beállítását és a nyelvi fájlt, valamint a feltételfájl felépítését.</w:t>
+      </w:r>
+    </w:p>
+    <w:p>
       <w:pPr>
         <w:pStyle w:val="Heading1"/>
+      </w:pPr>
+      <w:r>
+        <w:t>I. Alapvető használat</w:t>
+      </w:r>
+    </w:p>
+    <w:p>
+      <w:pPr>
+        <w:pStyle w:val="Heading2"/>
       </w:pPr>
       <w:r>
         <w:t>1. Mire való a program?</w:t>
@@ -42,7 +55,7 @@
     </w:p>
     <w:p>
       <w:pPr>
-        <w:pStyle w:val="Heading1"/>
+        <w:pStyle w:val="Heading2"/>
       </w:pPr>
       <w:r>
         <w:t>2. A program indítása</w:t>
@@ -82,220 +95,12 @@
     </w:p>
     <w:p>
       <w:r>
-        <w:t>Parancssorból további lehetőségek is vannak:</w:t>
+        <w:t>A program magyarul indul. A nyelv a főablak jobb felső sarkában, a Nyelv listában bármikor átváltható (Magyar / English); a betöltött kép és a beállított értékek ilyenkor megmaradnak. A nyelv tartós beállítását a 11. fejezet írja le.</w:t>
       </w:r>
     </w:p>
     <w:p>
       <w:pPr>
-        <w:spacing w:after="0"/>
-        <w:ind w:left="360"/>
-      </w:pPr>
-      <w:r>
-        <w:rPr>
-          <w:rFonts w:ascii="Consolas" w:hAnsi="Consolas" w:eastAsia="Consolas"/>
-          <w:sz w:val="19"/>
-        </w:rPr>
-        <w:t>TrademarkImage.exe</w:t>
-      </w:r>
-    </w:p>
-    <w:p>
-      <w:pPr>
-        <w:spacing w:after="0"/>
-        <w:ind w:left="360"/>
-      </w:pPr>
-      <w:r>
-        <w:rPr>
-          <w:rFonts w:ascii="Consolas" w:hAnsi="Consolas" w:eastAsia="Consolas"/>
-          <w:sz w:val="19"/>
-        </w:rPr>
-        <w:t>TrademarkImage.exe kep.jpg</w:t>
-      </w:r>
-    </w:p>
-    <w:p>
-      <w:pPr>
-        <w:spacing w:after="0"/>
-        <w:ind w:left="360"/>
-      </w:pPr>
-      <w:r>
-        <w:rPr>
-          <w:rFonts w:ascii="Consolas" w:hAnsi="Consolas" w:eastAsia="Consolas"/>
-          <w:sz w:val="19"/>
-        </w:rPr>
-        <w:t>TrademarkImage.exe --config sajat_feltetelek.json kep.jpg</w:t>
-      </w:r>
-    </w:p>
-    <w:p>
-      <w:pPr>
-        <w:spacing w:after="0"/>
-        <w:ind w:left="360"/>
-      </w:pPr>
-      <w:r>
-        <w:rPr>
-          <w:rFonts w:ascii="Consolas" w:hAnsi="Consolas" w:eastAsia="Consolas"/>
-          <w:sz w:val="19"/>
-        </w:rPr>
-        <w:t>TrademarkImage.exe --lang en</w:t>
-      </w:r>
-    </w:p>
-    <w:p>
-      <w:pPr>
-        <w:spacing w:after="0"/>
-        <w:ind w:left="360"/>
-      </w:pPr>
-      <w:r>
-        <w:rPr>
-          <w:rFonts w:ascii="Consolas" w:hAnsi="Consolas" w:eastAsia="Consolas"/>
-          <w:sz w:val="19"/>
-        </w:rPr>
-        <w:t>TrademarkImage.exe --locals sajat_szovegek.json</w:t>
-      </w:r>
-    </w:p>
-    <w:p>
-      <w:pPr>
-        <w:spacing w:after="0"/>
-      </w:pPr>
-    </w:p>
-    <w:tbl>
-      <w:tblPr>
-        <w:tblStyle w:val="TableGrid"/>
-        <w:tblW w:type="auto" w:w="0"/>
-        <w:tblLayout w:type="fixed"/>
-        <w:tblLook w:firstColumn="1" w:firstRow="1" w:lastColumn="0" w:lastRow="0" w:noHBand="0" w:noVBand="1" w:val="04A0"/>
-      </w:tblPr>
-      <w:tblGrid>
-        <w:gridCol w:w="2200"/>
-        <w:gridCol w:w="7200"/>
-      </w:tblGrid>
-      <w:tr>
-        <w:tc>
-          <w:tcPr>
-            <w:tcW w:type="dxa" w:w="2200"/>
-            <w:shd w:val="clear" w:color="auto" w:fill="D9E2F3"/>
-          </w:tcPr>
-          <w:p>
-            <w:r/>
-            <w:r>
-              <w:rPr>
-                <w:b/>
-              </w:rPr>
-              <w:t>Paraméter</w:t>
-            </w:r>
-          </w:p>
-        </w:tc>
-        <w:tc>
-          <w:tcPr>
-            <w:tcW w:type="dxa" w:w="7200"/>
-            <w:shd w:val="clear" w:color="auto" w:fill="D9E2F3"/>
-          </w:tcPr>
-          <w:p>
-            <w:r/>
-            <w:r>
-              <w:rPr>
-                <w:b/>
-              </w:rPr>
-              <w:t>Jelentése</w:t>
-            </w:r>
-          </w:p>
-        </w:tc>
-      </w:tr>
-      <w:tr>
-        <w:tc>
-          <w:tcPr>
-            <w:tcW w:type="dxa" w:w="2200"/>
-          </w:tcPr>
-          <w:p>
-            <w:r>
-              <w:t>--config FÁJL</w:t>
-            </w:r>
-          </w:p>
-        </w:tc>
-        <w:tc>
-          <w:tcPr>
-            <w:tcW w:type="dxa" w:w="7200"/>
-          </w:tcPr>
-          <w:p>
-            <w:r>
-              <w:t>A feltételeket tartalmazó JSON fájl (alapértelmezés: criterias.json az indítási könyvtárban).</w:t>
-            </w:r>
-          </w:p>
-        </w:tc>
-      </w:tr>
-      <w:tr>
-        <w:tc>
-          <w:tcPr>
-            <w:tcW w:type="dxa" w:w="2200"/>
-          </w:tcPr>
-          <w:p>
-            <w:r>
-              <w:t>--lang KÓD</w:t>
-            </w:r>
-          </w:p>
-        </w:tc>
-        <w:tc>
-          <w:tcPr>
-            <w:tcW w:type="dxa" w:w="7200"/>
-          </w:tcPr>
-          <w:p>
-            <w:r>
-              <w:t>A felület nyelve: hu (magyar) vagy en (angol), illetve bármely további, a locals.json-ba felvett nyelv kódja.</w:t>
-            </w:r>
-          </w:p>
-        </w:tc>
-      </w:tr>
-      <w:tr>
-        <w:tc>
-          <w:tcPr>
-            <w:tcW w:type="dxa" w:w="2200"/>
-          </w:tcPr>
-          <w:p>
-            <w:r>
-              <w:t>--locals FÁJL</w:t>
-            </w:r>
-          </w:p>
-        </w:tc>
-        <w:tc>
-          <w:tcPr>
-            <w:tcW w:type="dxa" w:w="7200"/>
-          </w:tcPr>
-          <w:p>
-            <w:r>
-              <w:t>Saját szövegfájl (alapértelmezés: locals.json az indítási könyvtárban, ha van).</w:t>
-            </w:r>
-          </w:p>
-        </w:tc>
-      </w:tr>
-      <w:tr>
-        <w:tc>
-          <w:tcPr>
-            <w:tcW w:type="dxa" w:w="2200"/>
-          </w:tcPr>
-          <w:p>
-            <w:r>
-              <w:t>KÉP</w:t>
-            </w:r>
-          </w:p>
-        </w:tc>
-        <w:tc>
-          <w:tcPr>
-            <w:tcW w:type="dxa" w:w="7200"/>
-          </w:tcPr>
-          <w:p>
-            <w:r>
-              <w:t>Induláskor megnyitandó képfájl.</w:t>
-            </w:r>
-          </w:p>
-        </w:tc>
-      </w:tr>
-    </w:tbl>
-    <w:p/>
-    <w:p>
-      <w:r>
-        <w:t>Ha az indítási könyvtárban van criterias.json nevű fájl, a program induláskor abból tölti be a feltételeket. Ha nincs ilyen fájl, az alapértelmezett feltételekkel dolgozik.</w:t>
-      </w:r>
-    </w:p>
-    <w:p>
-      <w:pPr>
-        <w:pStyle w:val="Heading1"/>
+        <w:pStyle w:val="Heading2"/>
       </w:pPr>
       <w:r>
         <w:t>3. A főablak részei</w:t>
@@ -458,172 +263,10 @@
     <w:p/>
     <w:p>
       <w:pPr>
-        <w:pStyle w:val="Heading1"/>
-      </w:pPr>
-      <w:r>
-        <w:t>4. A felület nyelve</w:t>
-      </w:r>
-    </w:p>
-    <w:p>
-      <w:r>
-        <w:t>A program alapértelmezés szerint magyarul indul. A nyelv a főablak jobb felső sarkában, a Nyelv listában bármikor átváltható; ilyenkor a betöltött kép és a már beállított értékek megmaradnak. A választás csak az adott futásra érvényes. Ha a program mindig más nyelven induljon, használja a --lang paramétert, vagy írja át a locals.json fájlban a "default_language" értékét (pl. "en").</w:t>
-      </w:r>
-    </w:p>
-    <w:p>
-      <w:pPr>
         <w:pStyle w:val="Heading2"/>
       </w:pPr>
       <w:r>
-        <w:t>4.1 Szövegek módosítása, új nyelv felvétele</w:t>
-      </w:r>
-    </w:p>
-    <w:p>
-      <w:r>
-        <w:t>A program összes szövege a locals.json fájlban van, amely az exe mellett található, és Jegyzettömbbel szerkeszthető (UTF-8 kódolással mentse). Felépítése:</w:t>
-      </w:r>
-    </w:p>
-    <w:p>
-      <w:pPr>
-        <w:spacing w:after="0"/>
-        <w:ind w:left="360"/>
-      </w:pPr>
-      <w:r>
-        <w:rPr>
-          <w:rFonts w:ascii="Consolas" w:hAnsi="Consolas" w:eastAsia="Consolas"/>
-          <w:sz w:val="19"/>
-        </w:rPr>
-        <w:t>{</w:t>
-      </w:r>
-    </w:p>
-    <w:p>
-      <w:pPr>
-        <w:spacing w:after="0"/>
-        <w:ind w:left="360"/>
-      </w:pPr>
-      <w:r>
-        <w:rPr>
-          <w:rFonts w:ascii="Consolas" w:hAnsi="Consolas" w:eastAsia="Consolas"/>
-          <w:sz w:val="19"/>
-        </w:rPr>
-        <w:t xml:space="preserve">  "default_language": "hu",</w:t>
-      </w:r>
-    </w:p>
-    <w:p>
-      <w:pPr>
-        <w:spacing w:after="0"/>
-        <w:ind w:left="360"/>
-      </w:pPr>
-      <w:r>
-        <w:rPr>
-          <w:rFonts w:ascii="Consolas" w:hAnsi="Consolas" w:eastAsia="Consolas"/>
-          <w:sz w:val="19"/>
-        </w:rPr>
-        <w:t xml:space="preserve">  "languages": {</w:t>
-      </w:r>
-    </w:p>
-    <w:p>
-      <w:pPr>
-        <w:spacing w:after="0"/>
-        <w:ind w:left="360"/>
-      </w:pPr>
-      <w:r>
-        <w:rPr>
-          <w:rFonts w:ascii="Consolas" w:hAnsi="Consolas" w:eastAsia="Consolas"/>
-          <w:sz w:val="19"/>
-        </w:rPr>
-        <w:t xml:space="preserve">    "hu": { "language_name": "Magyar",  "prop.width": "Szélesség", ... },</w:t>
-      </w:r>
-    </w:p>
-    <w:p>
-      <w:pPr>
-        <w:spacing w:after="0"/>
-        <w:ind w:left="360"/>
-      </w:pPr>
-      <w:r>
-        <w:rPr>
-          <w:rFonts w:ascii="Consolas" w:hAnsi="Consolas" w:eastAsia="Consolas"/>
-          <w:sz w:val="19"/>
-        </w:rPr>
-        <w:t xml:space="preserve">    "en": { "language_name": "English", "prop.width": "Width", ... }</w:t>
-      </w:r>
-    </w:p>
-    <w:p>
-      <w:pPr>
-        <w:spacing w:after="0"/>
-        <w:ind w:left="360"/>
-      </w:pPr>
-      <w:r>
-        <w:rPr>
-          <w:rFonts w:ascii="Consolas" w:hAnsi="Consolas" w:eastAsia="Consolas"/>
-          <w:sz w:val="19"/>
-        </w:rPr>
-        <w:t xml:space="preserve">  }</w:t>
-      </w:r>
-    </w:p>
-    <w:p>
-      <w:pPr>
-        <w:spacing w:after="0"/>
-        <w:ind w:left="360"/>
-      </w:pPr>
-      <w:r>
-        <w:rPr>
-          <w:rFonts w:ascii="Consolas" w:hAnsi="Consolas" w:eastAsia="Consolas"/>
-          <w:sz w:val="19"/>
-        </w:rPr>
-        <w:t>}</w:t>
-      </w:r>
-    </w:p>
-    <w:p>
-      <w:pPr>
-        <w:spacing w:after="0"/>
-      </w:pPr>
-    </w:p>
-    <w:p>
-      <w:pPr>
-        <w:pStyle w:val="ListBullet"/>
-      </w:pPr>
-      <w:r>
-        <w:t>Egy szöveg módosításához írja át az idézőjelek közötti értéket a kettőspont után. A kulcsot (a kettőspont előtti részt) ne változtassa meg.</w:t>
-      </w:r>
-    </w:p>
-    <w:p>
-      <w:pPr>
-        <w:pStyle w:val="ListBullet"/>
-      </w:pPr>
-      <w:r>
-        <w:t>A kapcsos zárójelben lévő részeket (pl. {value}, {path}) a program tölti ki - ezeket változatlanul hagyja meg. A \n új sort jelent.</w:t>
-      </w:r>
-    </w:p>
-    <w:p>
-      <w:pPr>
-        <w:pStyle w:val="ListBullet"/>
-      </w:pPr>
-      <w:r>
-        <w:t>Új nyelv felvétele: másolja le az "en" blokkot, adjon neki új kódot (pl. "de"), írja át a "language_name" értékét (pl. "Deutsch"), majd fordítsa le a szövegeket. A program következő indításakor az új nyelv megjelenik a Nyelv listában.</w:t>
-      </w:r>
-    </w:p>
-    <w:p>
-      <w:pPr>
-        <w:pStyle w:val="ListBullet"/>
-      </w:pPr>
-      <w:r>
-        <w:t>Ha egy szöveg hiányzik egy nyelvből, a program az angol szöveget mutatja. Hibás fájl esetén figyelmeztetést ad, és a beépített szövegekkel dolgozik.</w:t>
-      </w:r>
-    </w:p>
-    <w:p>
-      <w:pPr>
-        <w:pStyle w:val="ListBullet"/>
-      </w:pPr>
-      <w:r>
-        <w:t>Elég csak a megváltoztatott szövegeket tartalmazó fájlt az exe mellé tenni: a program a beépített szövegekhez hozzáadja, illetve azokat felülírja vele.</w:t>
-      </w:r>
-    </w:p>
-    <w:p>
-      <w:pPr>
-        <w:pStyle w:val="Heading1"/>
-      </w:pPr>
-      <w:r>
-        <w:t>5. Kép betöltése</w:t>
+        <w:t>4. Kép betöltése</w:t>
       </w:r>
     </w:p>
     <w:p>
@@ -657,18 +300,18 @@
     </w:p>
     <w:p>
       <w:pPr>
-        <w:pStyle w:val="Heading1"/>
+        <w:pStyle w:val="Heading2"/>
       </w:pPr>
       <w:r>
-        <w:t>6. Az ellenőrzés eredménye</w:t>
+        <w:t>5. Az ellenőrzés eredménye</w:t>
       </w:r>
     </w:p>
     <w:p>
       <w:pPr>
-        <w:pStyle w:val="Heading2"/>
+        <w:pStyle w:val="Heading3"/>
       </w:pPr>
       <w:r>
-        <w:t>6.1 A kép megfelel</w:t>
+        <w:t>5.1 A kép megfelel</w:t>
       </w:r>
     </w:p>
     <w:p>
@@ -678,10 +321,10 @@
     </w:p>
     <w:p>
       <w:pPr>
-        <w:pStyle w:val="Heading2"/>
+        <w:pStyle w:val="Heading3"/>
       </w:pPr>
       <w:r>
-        <w:t>6.2 A kép nem felel meg</w:t>
+        <w:t>5.2 A kép nem felel meg</w:t>
       </w:r>
     </w:p>
     <w:p>
@@ -691,10 +334,10 @@
     </w:p>
     <w:p>
       <w:pPr>
-        <w:pStyle w:val="Heading1"/>
+        <w:pStyle w:val="Heading2"/>
       </w:pPr>
       <w:r>
-        <w:t>7. A hibás értékek javítása</w:t>
+        <w:t>6. A hibás értékek javítása</w:t>
       </w:r>
     </w:p>
     <w:p>
@@ -791,10 +434,10 @@
     </w:p>
     <w:p>
       <w:pPr>
-        <w:pStyle w:val="Heading1"/>
+        <w:pStyle w:val="Heading2"/>
       </w:pPr>
       <w:r>
-        <w:t>8. Átalakítás és mentés</w:t>
+        <w:t>7. Átalakítás és mentés</w:t>
       </w:r>
     </w:p>
     <w:p>
@@ -1030,10 +673,10 @@
     </w:p>
     <w:p>
       <w:pPr>
-        <w:pStyle w:val="Heading1"/>
+        <w:pStyle w:val="Heading2"/>
       </w:pPr>
       <w:r>
-        <w:t>9. A feltételek beállítása</w:t>
+        <w:t>8. A feltételek beállítása</w:t>
       </w:r>
     </w:p>
     <w:tbl>
@@ -1044,14 +687,13 @@
         <w:tblLook w:firstColumn="1" w:firstRow="1" w:lastColumn="0" w:lastRow="0" w:noHBand="0" w:noVBand="1" w:val="04A0"/>
       </w:tblPr>
       <w:tblGrid>
-        <w:gridCol w:w="3000"/>
-        <w:gridCol w:w="2600"/>
-        <w:gridCol w:w="3800"/>
+        <w:gridCol w:w="4000"/>
+        <w:gridCol w:w="5400"/>
       </w:tblGrid>
       <w:tr>
         <w:tc>
           <w:tcPr>
-            <w:tcW w:type="dxa" w:w="3000"/>
+            <w:tcW w:type="dxa" w:w="4000"/>
             <w:shd w:val="clear" w:color="auto" w:fill="D9E2F3"/>
           </w:tcPr>
           <w:p>
@@ -1066,22 +708,7 @@
         </w:tc>
         <w:tc>
           <w:tcPr>
-            <w:tcW w:type="dxa" w:w="2600"/>
-            <w:shd w:val="clear" w:color="auto" w:fill="D9E2F3"/>
-          </w:tcPr>
-          <w:p>
-            <w:r/>
-            <w:r>
-              <w:rPr>
-                <w:b/>
-              </w:rPr>
-              <w:t>Kulcs a JSON fájlban</w:t>
-            </w:r>
-          </w:p>
-        </w:tc>
-        <w:tc>
-          <w:tcPr>
-            <w:tcW w:type="dxa" w:w="3800"/>
+            <w:tcW w:type="dxa" w:w="5400"/>
             <w:shd w:val="clear" w:color="auto" w:fill="D9E2F3"/>
           </w:tcPr>
           <w:p>
@@ -1098,7 +725,7 @@
       <w:tr>
         <w:tc>
           <w:tcPr>
-            <w:tcW w:type="dxa" w:w="3000"/>
+            <w:tcW w:type="dxa" w:w="4000"/>
           </w:tcPr>
           <w:p>
             <w:r>
@@ -1108,17 +735,7 @@
         </w:tc>
         <w:tc>
           <w:tcPr>
-            <w:tcW w:type="dxa" w:w="2600"/>
-          </w:tcPr>
-          <w:p>
-            <w:r>
-              <w:t>max_file_size_mb</w:t>
-            </w:r>
-          </w:p>
-        </w:tc>
-        <w:tc>
-          <w:tcPr>
-            <w:tcW w:type="dxa" w:w="3800"/>
+            <w:tcW w:type="dxa" w:w="5400"/>
           </w:tcPr>
           <w:p>
             <w:r>
@@ -1130,7 +747,7 @@
       <w:tr>
         <w:tc>
           <w:tcPr>
-            <w:tcW w:type="dxa" w:w="3000"/>
+            <w:tcW w:type="dxa" w:w="4000"/>
           </w:tcPr>
           <w:p>
             <w:r>
@@ -1140,17 +757,7 @@
         </w:tc>
         <w:tc>
           <w:tcPr>
-            <w:tcW w:type="dxa" w:w="2600"/>
-          </w:tcPr>
-          <w:p>
-            <w:r>
-              <w:t>min_width</w:t>
-            </w:r>
-          </w:p>
-        </w:tc>
-        <w:tc>
-          <w:tcPr>
-            <w:tcW w:type="dxa" w:w="3800"/>
+            <w:tcW w:type="dxa" w:w="5400"/>
           </w:tcPr>
           <w:p>
             <w:r>
@@ -1162,7 +769,7 @@
       <w:tr>
         <w:tc>
           <w:tcPr>
-            <w:tcW w:type="dxa" w:w="3000"/>
+            <w:tcW w:type="dxa" w:w="4000"/>
           </w:tcPr>
           <w:p>
             <w:r>
@@ -1172,17 +779,7 @@
         </w:tc>
         <w:tc>
           <w:tcPr>
-            <w:tcW w:type="dxa" w:w="2600"/>
-          </w:tcPr>
-          <w:p>
-            <w:r>
-              <w:t>min_height</w:t>
-            </w:r>
-          </w:p>
-        </w:tc>
-        <w:tc>
-          <w:tcPr>
-            <w:tcW w:type="dxa" w:w="3800"/>
+            <w:tcW w:type="dxa" w:w="5400"/>
           </w:tcPr>
           <w:p>
             <w:r>
@@ -1194,7 +791,7 @@
       <w:tr>
         <w:tc>
           <w:tcPr>
-            <w:tcW w:type="dxa" w:w="3000"/>
+            <w:tcW w:type="dxa" w:w="4000"/>
           </w:tcPr>
           <w:p>
             <w:r>
@@ -1204,17 +801,7 @@
         </w:tc>
         <w:tc>
           <w:tcPr>
-            <w:tcW w:type="dxa" w:w="2600"/>
-          </w:tcPr>
-          <w:p>
-            <w:r>
-              <w:t>max_width</w:t>
-            </w:r>
-          </w:p>
-        </w:tc>
-        <w:tc>
-          <w:tcPr>
-            <w:tcW w:type="dxa" w:w="3800"/>
+            <w:tcW w:type="dxa" w:w="5400"/>
           </w:tcPr>
           <w:p>
             <w:r>
@@ -1226,7 +813,7 @@
       <w:tr>
         <w:tc>
           <w:tcPr>
-            <w:tcW w:type="dxa" w:w="3000"/>
+            <w:tcW w:type="dxa" w:w="4000"/>
           </w:tcPr>
           <w:p>
             <w:r>
@@ -1236,17 +823,7 @@
         </w:tc>
         <w:tc>
           <w:tcPr>
-            <w:tcW w:type="dxa" w:w="2600"/>
-          </w:tcPr>
-          <w:p>
-            <w:r>
-              <w:t>max_height</w:t>
-            </w:r>
-          </w:p>
-        </w:tc>
-        <w:tc>
-          <w:tcPr>
-            <w:tcW w:type="dxa" w:w="3800"/>
+            <w:tcW w:type="dxa" w:w="5400"/>
           </w:tcPr>
           <w:p>
             <w:r>
@@ -1258,7 +835,7 @@
       <w:tr>
         <w:tc>
           <w:tcPr>
-            <w:tcW w:type="dxa" w:w="3000"/>
+            <w:tcW w:type="dxa" w:w="4000"/>
           </w:tcPr>
           <w:p>
             <w:r>
@@ -1268,17 +845,7 @@
         </w:tc>
         <w:tc>
           <w:tcPr>
-            <w:tcW w:type="dxa" w:w="2600"/>
-          </w:tcPr>
-          <w:p>
-            <w:r>
-              <w:t>min_dpi</w:t>
-            </w:r>
-          </w:p>
-        </w:tc>
-        <w:tc>
-          <w:tcPr>
-            <w:tcW w:type="dxa" w:w="3800"/>
+            <w:tcW w:type="dxa" w:w="5400"/>
           </w:tcPr>
           <w:p>
             <w:r>
@@ -1290,7 +857,7 @@
       <w:tr>
         <w:tc>
           <w:tcPr>
-            <w:tcW w:type="dxa" w:w="3000"/>
+            <w:tcW w:type="dxa" w:w="4000"/>
           </w:tcPr>
           <w:p>
             <w:r>
@@ -1300,17 +867,7 @@
         </w:tc>
         <w:tc>
           <w:tcPr>
-            <w:tcW w:type="dxa" w:w="2600"/>
-          </w:tcPr>
-          <w:p>
-            <w:r>
-              <w:t>allowed_types</w:t>
-            </w:r>
-          </w:p>
-        </w:tc>
-        <w:tc>
-          <w:tcPr>
-            <w:tcW w:type="dxa" w:w="3800"/>
+            <w:tcW w:type="dxa" w:w="5400"/>
           </w:tcPr>
           <w:p>
             <w:r>
@@ -1329,14 +886,13 @@
         <w:tblLook w:firstColumn="1" w:firstRow="1" w:lastColumn="0" w:lastRow="0" w:noHBand="0" w:noVBand="1" w:val="04A0"/>
       </w:tblPr>
       <w:tblGrid>
-        <w:gridCol w:w="3000"/>
-        <w:gridCol w:w="2600"/>
-        <w:gridCol w:w="3800"/>
+        <w:gridCol w:w="4000"/>
+        <w:gridCol w:w="5400"/>
       </w:tblGrid>
       <w:tr>
         <w:tc>
           <w:tcPr>
-            <w:tcW w:type="dxa" w:w="3000"/>
+            <w:tcW w:type="dxa" w:w="4000"/>
             <w:shd w:val="clear" w:color="auto" w:fill="D9E2F3"/>
           </w:tcPr>
           <w:p>
@@ -1345,28 +901,13 @@
               <w:rPr>
                 <w:b/>
               </w:rPr>
-              <w:t>Képtípus a felületen</w:t>
+              <w:t>Képtípus</w:t>
             </w:r>
           </w:p>
         </w:tc>
         <w:tc>
           <w:tcPr>
-            <w:tcW w:type="dxa" w:w="2600"/>
-            <w:shd w:val="clear" w:color="auto" w:fill="D9E2F3"/>
-          </w:tcPr>
-          <w:p>
-            <w:r/>
-            <w:r>
-              <w:rPr>
-                <w:b/>
-              </w:rPr>
-              <w:t>Azonosító a JSON fájlban</w:t>
-            </w:r>
-          </w:p>
-        </w:tc>
-        <w:tc>
-          <w:tcPr>
-            <w:tcW w:type="dxa" w:w="3800"/>
+            <w:tcW w:type="dxa" w:w="5400"/>
             <w:shd w:val="clear" w:color="auto" w:fill="D9E2F3"/>
           </w:tcPr>
           <w:p>
@@ -1383,7 +924,7 @@
       <w:tr>
         <w:tc>
           <w:tcPr>
-            <w:tcW w:type="dxa" w:w="3000"/>
+            <w:tcW w:type="dxa" w:w="4000"/>
           </w:tcPr>
           <w:p>
             <w:r>
@@ -1393,17 +934,7 @@
         </w:tc>
         <w:tc>
           <w:tcPr>
-            <w:tcW w:type="dxa" w:w="2600"/>
-          </w:tcPr>
-          <w:p>
-            <w:r>
-              <w:t>RGB</w:t>
-            </w:r>
-          </w:p>
-        </w:tc>
-        <w:tc>
-          <w:tcPr>
-            <w:tcW w:type="dxa" w:w="3800"/>
+            <w:tcW w:type="dxa" w:w="5400"/>
           </w:tcPr>
           <w:p>
             <w:r>
@@ -1415,7 +946,7 @@
       <w:tr>
         <w:tc>
           <w:tcPr>
-            <w:tcW w:type="dxa" w:w="3000"/>
+            <w:tcW w:type="dxa" w:w="4000"/>
           </w:tcPr>
           <w:p>
             <w:r>
@@ -1425,17 +956,7 @@
         </w:tc>
         <w:tc>
           <w:tcPr>
-            <w:tcW w:type="dxa" w:w="2600"/>
-          </w:tcPr>
-          <w:p>
-            <w:r>
-              <w:t>RGBA</w:t>
-            </w:r>
-          </w:p>
-        </w:tc>
-        <w:tc>
-          <w:tcPr>
-            <w:tcW w:type="dxa" w:w="3800"/>
+            <w:tcW w:type="dxa" w:w="5400"/>
           </w:tcPr>
           <w:p>
             <w:r>
@@ -1447,7 +968,7 @@
       <w:tr>
         <w:tc>
           <w:tcPr>
-            <w:tcW w:type="dxa" w:w="3000"/>
+            <w:tcW w:type="dxa" w:w="4000"/>
           </w:tcPr>
           <w:p>
             <w:r>
@@ -1457,17 +978,7 @@
         </w:tc>
         <w:tc>
           <w:tcPr>
-            <w:tcW w:type="dxa" w:w="2600"/>
-          </w:tcPr>
-          <w:p>
-            <w:r>
-              <w:t>greyscale</w:t>
-            </w:r>
-          </w:p>
-        </w:tc>
-        <w:tc>
-          <w:tcPr>
-            <w:tcW w:type="dxa" w:w="3800"/>
+            <w:tcW w:type="dxa" w:w="5400"/>
           </w:tcPr>
           <w:p>
             <w:r>
@@ -1479,7 +990,7 @@
       <w:tr>
         <w:tc>
           <w:tcPr>
-            <w:tcW w:type="dxa" w:w="3000"/>
+            <w:tcW w:type="dxa" w:w="4000"/>
           </w:tcPr>
           <w:p>
             <w:r>
@@ -1489,17 +1000,7 @@
         </w:tc>
         <w:tc>
           <w:tcPr>
-            <w:tcW w:type="dxa" w:w="2600"/>
-          </w:tcPr>
-          <w:p>
-            <w:r>
-              <w:t>B&amp;W</w:t>
-            </w:r>
-          </w:p>
-        </w:tc>
-        <w:tc>
-          <w:tcPr>
-            <w:tcW w:type="dxa" w:w="3800"/>
+            <w:tcW w:type="dxa" w:w="5400"/>
           </w:tcPr>
           <w:p>
             <w:r>
@@ -1511,7 +1012,7 @@
       <w:tr>
         <w:tc>
           <w:tcPr>
-            <w:tcW w:type="dxa" w:w="3000"/>
+            <w:tcW w:type="dxa" w:w="4000"/>
           </w:tcPr>
           <w:p>
             <w:r>
@@ -1521,17 +1022,7 @@
         </w:tc>
         <w:tc>
           <w:tcPr>
-            <w:tcW w:type="dxa" w:w="2600"/>
-          </w:tcPr>
-          <w:p>
-            <w:r>
-              <w:t>CMYK</w:t>
-            </w:r>
-          </w:p>
-        </w:tc>
-        <w:tc>
-          <w:tcPr>
-            <w:tcW w:type="dxa" w:w="3800"/>
+            <w:tcW w:type="dxa" w:w="5400"/>
           </w:tcPr>
           <w:p>
             <w:r>
@@ -1543,7 +1034,7 @@
       <w:tr>
         <w:tc>
           <w:tcPr>
-            <w:tcW w:type="dxa" w:w="3000"/>
+            <w:tcW w:type="dxa" w:w="4000"/>
           </w:tcPr>
           <w:p>
             <w:r>
@@ -1553,17 +1044,7 @@
         </w:tc>
         <w:tc>
           <w:tcPr>
-            <w:tcW w:type="dxa" w:w="2600"/>
-          </w:tcPr>
-          <w:p>
-            <w:r>
-              <w:t>palette</w:t>
-            </w:r>
-          </w:p>
-        </w:tc>
-        <w:tc>
-          <w:tcPr>
-            <w:tcW w:type="dxa" w:w="3800"/>
+            <w:tcW w:type="dxa" w:w="5400"/>
           </w:tcPr>
           <w:p>
             <w:r>
@@ -1612,142 +1093,15 @@
     </w:p>
     <w:p>
       <w:r>
-        <w:t>Más feltételkészlet betöltése: Feltételek betöltése... gomb, majd a JSON fájl kiválasztása. Mentés tetszőleges néven: Feltételek mentése másként... gomb.</w:t>
-      </w:r>
-    </w:p>
-    <w:p>
-      <w:r>
-        <w:t>Ha azt szeretné, hogy a program mindig a saját feltételeivel induljon, mentse őket criterias.json néven az exe mellé. A fájl egyszerű JSON szöveg, Jegyzettömbbel is szerkeszthető (a képtípusokat az azonosítójukkal kell megadni):</w:t>
+        <w:t>Más feltételkészlet betöltése: Feltételek betöltése... gomb, majd a JSON fájl kiválasztása. Mentés tetszőleges néven: Feltételek mentése másként... gomb. A feltételfájlokról bővebben a 12. fejezet szól.</w:t>
       </w:r>
     </w:p>
     <w:p>
       <w:pPr>
-        <w:spacing w:after="0"/>
-        <w:ind w:left="360"/>
+        <w:pStyle w:val="Heading2"/>
       </w:pPr>
       <w:r>
-        <w:rPr>
-          <w:rFonts w:ascii="Consolas" w:hAnsi="Consolas" w:eastAsia="Consolas"/>
-          <w:sz w:val="19"/>
-        </w:rPr>
-        <w:t>{</w:t>
-      </w:r>
-    </w:p>
-    <w:p>
-      <w:pPr>
-        <w:spacing w:after="0"/>
-        <w:ind w:left="360"/>
-      </w:pPr>
-      <w:r>
-        <w:rPr>
-          <w:rFonts w:ascii="Consolas" w:hAnsi="Consolas" w:eastAsia="Consolas"/>
-          <w:sz w:val="19"/>
-        </w:rPr>
-        <w:t xml:space="preserve">  "max_file_size_mb": 2.0,</w:t>
-      </w:r>
-    </w:p>
-    <w:p>
-      <w:pPr>
-        <w:spacing w:after="0"/>
-        <w:ind w:left="360"/>
-      </w:pPr>
-      <w:r>
-        <w:rPr>
-          <w:rFonts w:ascii="Consolas" w:hAnsi="Consolas" w:eastAsia="Consolas"/>
-          <w:sz w:val="19"/>
-        </w:rPr>
-        <w:t xml:space="preserve">  "min_width": 945,</w:t>
-      </w:r>
-    </w:p>
-    <w:p>
-      <w:pPr>
-        <w:spacing w:after="0"/>
-        <w:ind w:left="360"/>
-      </w:pPr>
-      <w:r>
-        <w:rPr>
-          <w:rFonts w:ascii="Consolas" w:hAnsi="Consolas" w:eastAsia="Consolas"/>
-          <w:sz w:val="19"/>
-        </w:rPr>
-        <w:t xml:space="preserve">  "min_height": 945,</w:t>
-      </w:r>
-    </w:p>
-    <w:p>
-      <w:pPr>
-        <w:spacing w:after="0"/>
-        <w:ind w:left="360"/>
-      </w:pPr>
-      <w:r>
-        <w:rPr>
-          <w:rFonts w:ascii="Consolas" w:hAnsi="Consolas" w:eastAsia="Consolas"/>
-          <w:sz w:val="19"/>
-        </w:rPr>
-        <w:t xml:space="preserve">  "max_width": 2835,</w:t>
-      </w:r>
-    </w:p>
-    <w:p>
-      <w:pPr>
-        <w:spacing w:after="0"/>
-        <w:ind w:left="360"/>
-      </w:pPr>
-      <w:r>
-        <w:rPr>
-          <w:rFonts w:ascii="Consolas" w:hAnsi="Consolas" w:eastAsia="Consolas"/>
-          <w:sz w:val="19"/>
-        </w:rPr>
-        <w:t xml:space="preserve">  "max_height": 2010,</w:t>
-      </w:r>
-    </w:p>
-    <w:p>
-      <w:pPr>
-        <w:spacing w:after="0"/>
-        <w:ind w:left="360"/>
-      </w:pPr>
-      <w:r>
-        <w:rPr>
-          <w:rFonts w:ascii="Consolas" w:hAnsi="Consolas" w:eastAsia="Consolas"/>
-          <w:sz w:val="19"/>
-        </w:rPr>
-        <w:t xml:space="preserve">  "min_dpi": 96.0,</w:t>
-      </w:r>
-    </w:p>
-    <w:p>
-      <w:pPr>
-        <w:spacing w:after="0"/>
-        <w:ind w:left="360"/>
-      </w:pPr>
-      <w:r>
-        <w:rPr>
-          <w:rFonts w:ascii="Consolas" w:hAnsi="Consolas" w:eastAsia="Consolas"/>
-          <w:sz w:val="19"/>
-        </w:rPr>
-        <w:t xml:space="preserve">  "allowed_types": ["RGB", "greyscale", "B&amp;W", "CMYK"]</w:t>
-      </w:r>
-    </w:p>
-    <w:p>
-      <w:pPr>
-        <w:spacing w:after="0"/>
-        <w:ind w:left="360"/>
-      </w:pPr>
-      <w:r>
-        <w:rPr>
-          <w:rFonts w:ascii="Consolas" w:hAnsi="Consolas" w:eastAsia="Consolas"/>
-          <w:sz w:val="19"/>
-        </w:rPr>
-        <w:t>}</w:t>
-      </w:r>
-    </w:p>
-    <w:p>
-      <w:pPr>
-        <w:spacing w:after="0"/>
-      </w:pPr>
-    </w:p>
-    <w:p>
-      <w:pPr>
-        <w:pStyle w:val="Heading1"/>
-      </w:pPr>
-      <w:r>
-        <w:t>10. Gyakori kérdések és hibaüzenetek</w:t>
+        <w:t>9. Gyakori kérdések és hibaüzenetek</w:t>
       </w:r>
     </w:p>
     <w:tbl>
@@ -1925,6 +1279,1196 @@
           </w:p>
         </w:tc>
       </w:tr>
+    </w:tbl>
+    <w:p/>
+    <w:p>
+      <w:r>
+        <w:br w:type="page"/>
+      </w:r>
+    </w:p>
+    <w:p>
+      <w:pPr>
+        <w:pStyle w:val="Heading1"/>
+      </w:pPr>
+      <w:r>
+        <w:t>II. Haladó használat és testreszabás</w:t>
+      </w:r>
+    </w:p>
+    <w:p>
+      <w:pPr>
+        <w:pStyle w:val="Heading2"/>
+      </w:pPr>
+      <w:r>
+        <w:t>10. Parancssori paraméterek</w:t>
+      </w:r>
+    </w:p>
+    <w:p>
+      <w:r>
+        <w:t>A program parancssorból (vagy parancsikonból) paraméterekkel is indítható:</w:t>
+      </w:r>
+    </w:p>
+    <w:p>
+      <w:pPr>
+        <w:spacing w:after="0"/>
+        <w:ind w:left="360"/>
+      </w:pPr>
+      <w:r>
+        <w:rPr>
+          <w:rFonts w:ascii="Consolas" w:hAnsi="Consolas" w:eastAsia="Consolas"/>
+          <w:sz w:val="19"/>
+        </w:rPr>
+        <w:t>TrademarkImage.exe</w:t>
+      </w:r>
+    </w:p>
+    <w:p>
+      <w:pPr>
+        <w:spacing w:after="0"/>
+        <w:ind w:left="360"/>
+      </w:pPr>
+      <w:r>
+        <w:rPr>
+          <w:rFonts w:ascii="Consolas" w:hAnsi="Consolas" w:eastAsia="Consolas"/>
+          <w:sz w:val="19"/>
+        </w:rPr>
+        <w:t>TrademarkImage.exe kep.jpg</w:t>
+      </w:r>
+    </w:p>
+    <w:p>
+      <w:pPr>
+        <w:spacing w:after="0"/>
+        <w:ind w:left="360"/>
+      </w:pPr>
+      <w:r>
+        <w:rPr>
+          <w:rFonts w:ascii="Consolas" w:hAnsi="Consolas" w:eastAsia="Consolas"/>
+          <w:sz w:val="19"/>
+        </w:rPr>
+        <w:t>TrademarkImage.exe --config sajat_feltetelek.json kep.jpg</w:t>
+      </w:r>
+    </w:p>
+    <w:p>
+      <w:pPr>
+        <w:spacing w:after="0"/>
+        <w:ind w:left="360"/>
+      </w:pPr>
+      <w:r>
+        <w:rPr>
+          <w:rFonts w:ascii="Consolas" w:hAnsi="Consolas" w:eastAsia="Consolas"/>
+          <w:sz w:val="19"/>
+        </w:rPr>
+        <w:t>TrademarkImage.exe --lang en</w:t>
+      </w:r>
+    </w:p>
+    <w:p>
+      <w:pPr>
+        <w:spacing w:after="0"/>
+        <w:ind w:left="360"/>
+      </w:pPr>
+      <w:r>
+        <w:rPr>
+          <w:rFonts w:ascii="Consolas" w:hAnsi="Consolas" w:eastAsia="Consolas"/>
+          <w:sz w:val="19"/>
+        </w:rPr>
+        <w:t>TrademarkImage.exe --locals sajat_szovegek.json</w:t>
+      </w:r>
+    </w:p>
+    <w:p>
+      <w:pPr>
+        <w:spacing w:after="0"/>
+      </w:pPr>
+    </w:p>
+    <w:tbl>
+      <w:tblPr>
+        <w:tblStyle w:val="TableGrid"/>
+        <w:tblW w:type="auto" w:w="0"/>
+        <w:tblLayout w:type="fixed"/>
+        <w:tblLook w:firstColumn="1" w:firstRow="1" w:lastColumn="0" w:lastRow="0" w:noHBand="0" w:noVBand="1" w:val="04A0"/>
+      </w:tblPr>
+      <w:tblGrid>
+        <w:gridCol w:w="2200"/>
+        <w:gridCol w:w="7200"/>
+      </w:tblGrid>
+      <w:tr>
+        <w:tc>
+          <w:tcPr>
+            <w:tcW w:type="dxa" w:w="2200"/>
+            <w:shd w:val="clear" w:color="auto" w:fill="D9E2F3"/>
+          </w:tcPr>
+          <w:p>
+            <w:r/>
+            <w:r>
+              <w:rPr>
+                <w:b/>
+              </w:rPr>
+              <w:t>Paraméter</w:t>
+            </w:r>
+          </w:p>
+        </w:tc>
+        <w:tc>
+          <w:tcPr>
+            <w:tcW w:type="dxa" w:w="7200"/>
+            <w:shd w:val="clear" w:color="auto" w:fill="D9E2F3"/>
+          </w:tcPr>
+          <w:p>
+            <w:r/>
+            <w:r>
+              <w:rPr>
+                <w:b/>
+              </w:rPr>
+              <w:t>Jelentése</w:t>
+            </w:r>
+          </w:p>
+        </w:tc>
+      </w:tr>
+      <w:tr>
+        <w:tc>
+          <w:tcPr>
+            <w:tcW w:type="dxa" w:w="2200"/>
+          </w:tcPr>
+          <w:p>
+            <w:r>
+              <w:t>--config FÁJL</w:t>
+            </w:r>
+          </w:p>
+        </w:tc>
+        <w:tc>
+          <w:tcPr>
+            <w:tcW w:type="dxa" w:w="7200"/>
+          </w:tcPr>
+          <w:p>
+            <w:r>
+              <w:t>A feltételeket tartalmazó JSON fájl (alapértelmezés: criterias.json az indítási könyvtárban). Lásd a 12. fejezetet.</w:t>
+            </w:r>
+          </w:p>
+        </w:tc>
+      </w:tr>
+      <w:tr>
+        <w:tc>
+          <w:tcPr>
+            <w:tcW w:type="dxa" w:w="2200"/>
+          </w:tcPr>
+          <w:p>
+            <w:r>
+              <w:t>--lang KÓD</w:t>
+            </w:r>
+          </w:p>
+        </w:tc>
+        <w:tc>
+          <w:tcPr>
+            <w:tcW w:type="dxa" w:w="7200"/>
+          </w:tcPr>
+          <w:p>
+            <w:r>
+              <w:t>A felület nyelve: hu (magyar) vagy en (angol), illetve bármely további, a locals.json-ba felvett nyelv kódja. Lásd a 11. fejezetet.</w:t>
+            </w:r>
+          </w:p>
+        </w:tc>
+      </w:tr>
+      <w:tr>
+        <w:tc>
+          <w:tcPr>
+            <w:tcW w:type="dxa" w:w="2200"/>
+          </w:tcPr>
+          <w:p>
+            <w:r>
+              <w:t>--locals FÁJL</w:t>
+            </w:r>
+          </w:p>
+        </w:tc>
+        <w:tc>
+          <w:tcPr>
+            <w:tcW w:type="dxa" w:w="7200"/>
+          </w:tcPr>
+          <w:p>
+            <w:r>
+              <w:t>Saját szövegfájl (alapértelmezés: locals.json az indítási könyvtárban, ha van).</w:t>
+            </w:r>
+          </w:p>
+        </w:tc>
+      </w:tr>
+      <w:tr>
+        <w:tc>
+          <w:tcPr>
+            <w:tcW w:type="dxa" w:w="2200"/>
+          </w:tcPr>
+          <w:p>
+            <w:r>
+              <w:t>KÉP</w:t>
+            </w:r>
+          </w:p>
+        </w:tc>
+        <w:tc>
+          <w:tcPr>
+            <w:tcW w:type="dxa" w:w="7200"/>
+          </w:tcPr>
+          <w:p>
+            <w:r>
+              <w:t>Induláskor megnyitandó képfájl.</w:t>
+            </w:r>
+          </w:p>
+        </w:tc>
+      </w:tr>
+      <w:tr>
+        <w:tc>
+          <w:tcPr>
+            <w:tcW w:type="dxa" w:w="2200"/>
+          </w:tcPr>
+          <w:p>
+            <w:r>
+              <w:t>--version</w:t>
+            </w:r>
+          </w:p>
+        </w:tc>
+        <w:tc>
+          <w:tcPr>
+            <w:tcW w:type="dxa" w:w="7200"/>
+          </w:tcPr>
+          <w:p>
+            <w:r>
+              <w:t>Kiírja a program verziószámát.</w:t>
+            </w:r>
+          </w:p>
+        </w:tc>
+      </w:tr>
+    </w:tbl>
+    <w:p/>
+    <w:p>
+      <w:r>
+        <w:t>Az indítási könyvtár dupla kattintásos indításnál az exe mappája. Parancsikon esetén a parancsikon „Indítás helye” mezője adja meg.</w:t>
+      </w:r>
+    </w:p>
+    <w:p>
+      <w:pPr>
+        <w:pStyle w:val="Heading2"/>
+      </w:pPr>
+      <w:r>
+        <w:t>11. A nyelv beállítása és a nyelvi fájl</w:t>
+      </w:r>
+    </w:p>
+    <w:p>
+      <w:pPr>
+        <w:pStyle w:val="Heading3"/>
+      </w:pPr>
+      <w:r>
+        <w:t>11.1 A nyelv kiválasztása</w:t>
+      </w:r>
+    </w:p>
+    <w:p>
+      <w:pPr>
+        <w:pStyle w:val="ListBullet"/>
+      </w:pPr>
+      <w:r>
+        <w:rPr>
+          <w:b/>
+        </w:rPr>
+        <w:t xml:space="preserve">Futás közben: </w:t>
+      </w:r>
+      <w:r>
+        <w:t>a főablak jobb felső sarkában lévő Nyelv listában. A választás csak az adott futásra érvényes.</w:t>
+      </w:r>
+    </w:p>
+    <w:p>
+      <w:pPr>
+        <w:pStyle w:val="ListBullet"/>
+      </w:pPr>
+      <w:r>
+        <w:rPr>
+          <w:b/>
+        </w:rPr>
+        <w:t xml:space="preserve">Indításkor: </w:t>
+      </w:r>
+      <w:r>
+        <w:t>a --lang paraméterrel, pl. TrademarkImage.exe --lang en.</w:t>
+      </w:r>
+    </w:p>
+    <w:p>
+      <w:pPr>
+        <w:pStyle w:val="ListBullet"/>
+      </w:pPr>
+      <w:r>
+        <w:rPr>
+          <w:b/>
+        </w:rPr>
+        <w:t xml:space="preserve">Tartósan: </w:t>
+      </w:r>
+      <w:r>
+        <w:t>a locals.json fájlban a "default_language" értékének átírásával (pl. "en").</w:t>
+      </w:r>
+    </w:p>
+    <w:p>
+      <w:pPr>
+        <w:pStyle w:val="Heading3"/>
+      </w:pPr>
+      <w:r>
+        <w:t>11.2 A locals.json felépítése</w:t>
+      </w:r>
+    </w:p>
+    <w:p>
+      <w:r>
+        <w:t>A program összes szövege a locals.json fájlban van, amely az exe mellett található, és Jegyzettömbbel szerkeszthető (UTF-8 kódolással mentse). Felépítése:</w:t>
+      </w:r>
+    </w:p>
+    <w:p>
+      <w:pPr>
+        <w:spacing w:after="0"/>
+        <w:ind w:left="360"/>
+      </w:pPr>
+      <w:r>
+        <w:rPr>
+          <w:rFonts w:ascii="Consolas" w:hAnsi="Consolas" w:eastAsia="Consolas"/>
+          <w:sz w:val="19"/>
+        </w:rPr>
+        <w:t>{</w:t>
+      </w:r>
+    </w:p>
+    <w:p>
+      <w:pPr>
+        <w:spacing w:after="0"/>
+        <w:ind w:left="360"/>
+      </w:pPr>
+      <w:r>
+        <w:rPr>
+          <w:rFonts w:ascii="Consolas" w:hAnsi="Consolas" w:eastAsia="Consolas"/>
+          <w:sz w:val="19"/>
+        </w:rPr>
+        <w:t xml:space="preserve">  "default_language": "hu",</w:t>
+      </w:r>
+    </w:p>
+    <w:p>
+      <w:pPr>
+        <w:spacing w:after="0"/>
+        <w:ind w:left="360"/>
+      </w:pPr>
+      <w:r>
+        <w:rPr>
+          <w:rFonts w:ascii="Consolas" w:hAnsi="Consolas" w:eastAsia="Consolas"/>
+          <w:sz w:val="19"/>
+        </w:rPr>
+        <w:t xml:space="preserve">  "languages": {</w:t>
+      </w:r>
+    </w:p>
+    <w:p>
+      <w:pPr>
+        <w:spacing w:after="0"/>
+        <w:ind w:left="360"/>
+      </w:pPr>
+      <w:r>
+        <w:rPr>
+          <w:rFonts w:ascii="Consolas" w:hAnsi="Consolas" w:eastAsia="Consolas"/>
+          <w:sz w:val="19"/>
+        </w:rPr>
+        <w:t xml:space="preserve">    "hu": { "language_name": "Magyar",  "prop.width": "Szélesség", ... },</w:t>
+      </w:r>
+    </w:p>
+    <w:p>
+      <w:pPr>
+        <w:spacing w:after="0"/>
+        <w:ind w:left="360"/>
+      </w:pPr>
+      <w:r>
+        <w:rPr>
+          <w:rFonts w:ascii="Consolas" w:hAnsi="Consolas" w:eastAsia="Consolas"/>
+          <w:sz w:val="19"/>
+        </w:rPr>
+        <w:t xml:space="preserve">    "en": { "language_name": "English", "prop.width": "Width", ... }</w:t>
+      </w:r>
+    </w:p>
+    <w:p>
+      <w:pPr>
+        <w:spacing w:after="0"/>
+        <w:ind w:left="360"/>
+      </w:pPr>
+      <w:r>
+        <w:rPr>
+          <w:rFonts w:ascii="Consolas" w:hAnsi="Consolas" w:eastAsia="Consolas"/>
+          <w:sz w:val="19"/>
+        </w:rPr>
+        <w:t xml:space="preserve">  }</w:t>
+      </w:r>
+    </w:p>
+    <w:p>
+      <w:pPr>
+        <w:spacing w:after="0"/>
+        <w:ind w:left="360"/>
+      </w:pPr>
+      <w:r>
+        <w:rPr>
+          <w:rFonts w:ascii="Consolas" w:hAnsi="Consolas" w:eastAsia="Consolas"/>
+          <w:sz w:val="19"/>
+        </w:rPr>
+        <w:t>}</w:t>
+      </w:r>
+    </w:p>
+    <w:p>
+      <w:pPr>
+        <w:spacing w:after="0"/>
+      </w:pPr>
+    </w:p>
+    <w:p>
+      <w:pPr>
+        <w:pStyle w:val="ListBullet"/>
+      </w:pPr>
+      <w:r>
+        <w:t>Egy szöveg módosításához írja át az idézőjelek közötti értéket a kettőspont után. A kulcsot (a kettőspont előtti részt) ne változtassa meg.</w:t>
+      </w:r>
+    </w:p>
+    <w:p>
+      <w:pPr>
+        <w:pStyle w:val="ListBullet"/>
+      </w:pPr>
+      <w:r>
+        <w:t>A kapcsos zárójelben lévő részeket (pl. {value}, {path}) a program tölti ki - ezeket változatlanul hagyja meg. A \n új sort jelent.</w:t>
+      </w:r>
+    </w:p>
+    <w:p>
+      <w:pPr>
+        <w:pStyle w:val="ListBullet"/>
+      </w:pPr>
+      <w:r>
+        <w:t>Ha egy szöveg hiányzik egy nyelvből, a program az angol szöveget mutatja. Hibás fájl esetén figyelmeztetést ad, és a beépített szövegekkel dolgozik.</w:t>
+      </w:r>
+    </w:p>
+    <w:p>
+      <w:pPr>
+        <w:pStyle w:val="ListBullet"/>
+      </w:pPr>
+      <w:r>
+        <w:t>Elég csak a megváltoztatott szövegeket tartalmazó fájlt az exe mellé tenni: a program a beépített szövegekhez hozzáadja, illetve azokat felülírja vele.</w:t>
+      </w:r>
+    </w:p>
+    <w:p>
+      <w:pPr>
+        <w:pStyle w:val="Heading3"/>
+      </w:pPr>
+      <w:r>
+        <w:t>11.3 Új nyelv felvétele</w:t>
+      </w:r>
+    </w:p>
+    <w:p>
+      <w:pPr>
+        <w:pStyle w:val="ListNumber"/>
+        <w:numPr>
+          <w:ilvl w:val="0"/>
+          <w:numId w:val="13"/>
+        </w:numPr>
+      </w:pPr>
+      <w:r>
+        <w:t>Nyissa meg a locals.json fájlt, és másolja le az "en" blokkot.</w:t>
+      </w:r>
+    </w:p>
+    <w:p>
+      <w:pPr>
+        <w:pStyle w:val="ListNumber"/>
+        <w:numPr>
+          <w:ilvl w:val="0"/>
+          <w:numId w:val="13"/>
+        </w:numPr>
+      </w:pPr>
+      <w:r>
+        <w:t>Adjon neki új kódot (pl. "de"), és írja át a "language_name" értékét (pl. "Deutsch").</w:t>
+      </w:r>
+    </w:p>
+    <w:p>
+      <w:pPr>
+        <w:pStyle w:val="ListNumber"/>
+        <w:numPr>
+          <w:ilvl w:val="0"/>
+          <w:numId w:val="13"/>
+        </w:numPr>
+      </w:pPr>
+      <w:r>
+        <w:t>Fordítsa le a szövegeket, majd mentse a fájlt UTF-8 kódolással.</w:t>
+      </w:r>
+    </w:p>
+    <w:p>
+      <w:pPr>
+        <w:pStyle w:val="ListNumber"/>
+        <w:numPr>
+          <w:ilvl w:val="0"/>
+          <w:numId w:val="13"/>
+        </w:numPr>
+      </w:pPr>
+      <w:r>
+        <w:t>A program következő indításakor az új nyelv megjelenik a Nyelv listában.</w:t>
+      </w:r>
+    </w:p>
+    <w:p>
+      <w:pPr>
+        <w:pStyle w:val="Heading2"/>
+      </w:pPr>
+      <w:r>
+        <w:t>12. A feltételfájl</w:t>
+      </w:r>
+    </w:p>
+    <w:p>
+      <w:r>
+        <w:t>Induláskor a program az indítási könyvtárban lévő criterias.json fájlból tölti be a feltételeket, vagy a --config paraméterrel megadott fájlból. Ha azt szeretné, hogy a program mindig a saját feltételeivel induljon, mentse őket criterias.json néven az exe mellé (Feltételek mentése másként... gomb). A feltételfájl egyszerű JSON szöveg, Jegyzettömbbel is szerkeszthető:</w:t>
+      </w:r>
+    </w:p>
+    <w:p>
+      <w:pPr>
+        <w:spacing w:after="0"/>
+        <w:ind w:left="360"/>
+      </w:pPr>
+      <w:r>
+        <w:rPr>
+          <w:rFonts w:ascii="Consolas" w:hAnsi="Consolas" w:eastAsia="Consolas"/>
+          <w:sz w:val="19"/>
+        </w:rPr>
+        <w:t>{</w:t>
+      </w:r>
+    </w:p>
+    <w:p>
+      <w:pPr>
+        <w:spacing w:after="0"/>
+        <w:ind w:left="360"/>
+      </w:pPr>
+      <w:r>
+        <w:rPr>
+          <w:rFonts w:ascii="Consolas" w:hAnsi="Consolas" w:eastAsia="Consolas"/>
+          <w:sz w:val="19"/>
+        </w:rPr>
+        <w:t xml:space="preserve">  "max_file_size_mb": 2.0,</w:t>
+      </w:r>
+    </w:p>
+    <w:p>
+      <w:pPr>
+        <w:spacing w:after="0"/>
+        <w:ind w:left="360"/>
+      </w:pPr>
+      <w:r>
+        <w:rPr>
+          <w:rFonts w:ascii="Consolas" w:hAnsi="Consolas" w:eastAsia="Consolas"/>
+          <w:sz w:val="19"/>
+        </w:rPr>
+        <w:t xml:space="preserve">  "min_width": 945,</w:t>
+      </w:r>
+    </w:p>
+    <w:p>
+      <w:pPr>
+        <w:spacing w:after="0"/>
+        <w:ind w:left="360"/>
+      </w:pPr>
+      <w:r>
+        <w:rPr>
+          <w:rFonts w:ascii="Consolas" w:hAnsi="Consolas" w:eastAsia="Consolas"/>
+          <w:sz w:val="19"/>
+        </w:rPr>
+        <w:t xml:space="preserve">  "min_height": 945,</w:t>
+      </w:r>
+    </w:p>
+    <w:p>
+      <w:pPr>
+        <w:spacing w:after="0"/>
+        <w:ind w:left="360"/>
+      </w:pPr>
+      <w:r>
+        <w:rPr>
+          <w:rFonts w:ascii="Consolas" w:hAnsi="Consolas" w:eastAsia="Consolas"/>
+          <w:sz w:val="19"/>
+        </w:rPr>
+        <w:t xml:space="preserve">  "max_width": 2835,</w:t>
+      </w:r>
+    </w:p>
+    <w:p>
+      <w:pPr>
+        <w:spacing w:after="0"/>
+        <w:ind w:left="360"/>
+      </w:pPr>
+      <w:r>
+        <w:rPr>
+          <w:rFonts w:ascii="Consolas" w:hAnsi="Consolas" w:eastAsia="Consolas"/>
+          <w:sz w:val="19"/>
+        </w:rPr>
+        <w:t xml:space="preserve">  "max_height": 2010,</w:t>
+      </w:r>
+    </w:p>
+    <w:p>
+      <w:pPr>
+        <w:spacing w:after="0"/>
+        <w:ind w:left="360"/>
+      </w:pPr>
+      <w:r>
+        <w:rPr>
+          <w:rFonts w:ascii="Consolas" w:hAnsi="Consolas" w:eastAsia="Consolas"/>
+          <w:sz w:val="19"/>
+        </w:rPr>
+        <w:t xml:space="preserve">  "min_dpi": 96.0,</w:t>
+      </w:r>
+    </w:p>
+    <w:p>
+      <w:pPr>
+        <w:spacing w:after="0"/>
+        <w:ind w:left="360"/>
+      </w:pPr>
+      <w:r>
+        <w:rPr>
+          <w:rFonts w:ascii="Consolas" w:hAnsi="Consolas" w:eastAsia="Consolas"/>
+          <w:sz w:val="19"/>
+        </w:rPr>
+        <w:t xml:space="preserve">  "allowed_types": ["RGB", "greyscale", "B&amp;W", "CMYK"]</w:t>
+      </w:r>
+    </w:p>
+    <w:p>
+      <w:pPr>
+        <w:spacing w:after="0"/>
+        <w:ind w:left="360"/>
+      </w:pPr>
+      <w:r>
+        <w:rPr>
+          <w:rFonts w:ascii="Consolas" w:hAnsi="Consolas" w:eastAsia="Consolas"/>
+          <w:sz w:val="19"/>
+        </w:rPr>
+        <w:t>}</w:t>
+      </w:r>
+    </w:p>
+    <w:p>
+      <w:pPr>
+        <w:spacing w:after="0"/>
+      </w:pPr>
+    </w:p>
+    <w:tbl>
+      <w:tblPr>
+        <w:tblStyle w:val="TableGrid"/>
+        <w:tblW w:type="auto" w:w="0"/>
+        <w:tblLayout w:type="fixed"/>
+        <w:tblLook w:firstColumn="1" w:firstRow="1" w:lastColumn="0" w:lastRow="0" w:noHBand="0" w:noVBand="1" w:val="04A0"/>
+      </w:tblPr>
+      <w:tblGrid>
+        <w:gridCol w:w="2400"/>
+        <w:gridCol w:w="3600"/>
+        <w:gridCol w:w="3400"/>
+      </w:tblGrid>
+      <w:tr>
+        <w:tc>
+          <w:tcPr>
+            <w:tcW w:type="dxa" w:w="2400"/>
+            <w:shd w:val="clear" w:color="auto" w:fill="D9E2F3"/>
+          </w:tcPr>
+          <w:p>
+            <w:r/>
+            <w:r>
+              <w:rPr>
+                <w:b/>
+              </w:rPr>
+              <w:t>Kulcs</w:t>
+            </w:r>
+          </w:p>
+        </w:tc>
+        <w:tc>
+          <w:tcPr>
+            <w:tcW w:type="dxa" w:w="3600"/>
+            <w:shd w:val="clear" w:color="auto" w:fill="D9E2F3"/>
+          </w:tcPr>
+          <w:p>
+            <w:r/>
+            <w:r>
+              <w:rPr>
+                <w:b/>
+              </w:rPr>
+              <w:t>Mező a felületen</w:t>
+            </w:r>
+          </w:p>
+        </w:tc>
+        <w:tc>
+          <w:tcPr>
+            <w:tcW w:type="dxa" w:w="3400"/>
+            <w:shd w:val="clear" w:color="auto" w:fill="D9E2F3"/>
+          </w:tcPr>
+          <w:p>
+            <w:r/>
+            <w:r>
+              <w:rPr>
+                <w:b/>
+              </w:rPr>
+              <w:t>Alapérték</w:t>
+            </w:r>
+          </w:p>
+        </w:tc>
+      </w:tr>
+      <w:tr>
+        <w:tc>
+          <w:tcPr>
+            <w:tcW w:type="dxa" w:w="2400"/>
+          </w:tcPr>
+          <w:p>
+            <w:r>
+              <w:t>max_file_size_mb</w:t>
+            </w:r>
+          </w:p>
+        </w:tc>
+        <w:tc>
+          <w:tcPr>
+            <w:tcW w:type="dxa" w:w="3600"/>
+          </w:tcPr>
+          <w:p>
+            <w:r>
+              <w:t>Legnagyobb fájlméret (MB)</w:t>
+            </w:r>
+          </w:p>
+        </w:tc>
+        <w:tc>
+          <w:tcPr>
+            <w:tcW w:type="dxa" w:w="3400"/>
+          </w:tcPr>
+          <w:p>
+            <w:r>
+              <w:t>2.0</w:t>
+            </w:r>
+          </w:p>
+        </w:tc>
+      </w:tr>
+      <w:tr>
+        <w:tc>
+          <w:tcPr>
+            <w:tcW w:type="dxa" w:w="2400"/>
+          </w:tcPr>
+          <w:p>
+            <w:r>
+              <w:t>min_width</w:t>
+            </w:r>
+          </w:p>
+        </w:tc>
+        <w:tc>
+          <w:tcPr>
+            <w:tcW w:type="dxa" w:w="3600"/>
+          </w:tcPr>
+          <w:p>
+            <w:r>
+              <w:t>Legkisebb szélesség (px)</w:t>
+            </w:r>
+          </w:p>
+        </w:tc>
+        <w:tc>
+          <w:tcPr>
+            <w:tcW w:type="dxa" w:w="3400"/>
+          </w:tcPr>
+          <w:p>
+            <w:r>
+              <w:t>945</w:t>
+            </w:r>
+          </w:p>
+        </w:tc>
+      </w:tr>
+      <w:tr>
+        <w:tc>
+          <w:tcPr>
+            <w:tcW w:type="dxa" w:w="2400"/>
+          </w:tcPr>
+          <w:p>
+            <w:r>
+              <w:t>min_height</w:t>
+            </w:r>
+          </w:p>
+        </w:tc>
+        <w:tc>
+          <w:tcPr>
+            <w:tcW w:type="dxa" w:w="3600"/>
+          </w:tcPr>
+          <w:p>
+            <w:r>
+              <w:t>Legkisebb magasság (px)</w:t>
+            </w:r>
+          </w:p>
+        </w:tc>
+        <w:tc>
+          <w:tcPr>
+            <w:tcW w:type="dxa" w:w="3400"/>
+          </w:tcPr>
+          <w:p>
+            <w:r>
+              <w:t>945</w:t>
+            </w:r>
+          </w:p>
+        </w:tc>
+      </w:tr>
+      <w:tr>
+        <w:tc>
+          <w:tcPr>
+            <w:tcW w:type="dxa" w:w="2400"/>
+          </w:tcPr>
+          <w:p>
+            <w:r>
+              <w:t>max_width</w:t>
+            </w:r>
+          </w:p>
+        </w:tc>
+        <w:tc>
+          <w:tcPr>
+            <w:tcW w:type="dxa" w:w="3600"/>
+          </w:tcPr>
+          <w:p>
+            <w:r>
+              <w:t>Legnagyobb szélesség (px)</w:t>
+            </w:r>
+          </w:p>
+        </w:tc>
+        <w:tc>
+          <w:tcPr>
+            <w:tcW w:type="dxa" w:w="3400"/>
+          </w:tcPr>
+          <w:p>
+            <w:r>
+              <w:t>2835</w:t>
+            </w:r>
+          </w:p>
+        </w:tc>
+      </w:tr>
+      <w:tr>
+        <w:tc>
+          <w:tcPr>
+            <w:tcW w:type="dxa" w:w="2400"/>
+          </w:tcPr>
+          <w:p>
+            <w:r>
+              <w:t>max_height</w:t>
+            </w:r>
+          </w:p>
+        </w:tc>
+        <w:tc>
+          <w:tcPr>
+            <w:tcW w:type="dxa" w:w="3600"/>
+          </w:tcPr>
+          <w:p>
+            <w:r>
+              <w:t>Legnagyobb magasság (px)</w:t>
+            </w:r>
+          </w:p>
+        </w:tc>
+        <w:tc>
+          <w:tcPr>
+            <w:tcW w:type="dxa" w:w="3400"/>
+          </w:tcPr>
+          <w:p>
+            <w:r>
+              <w:t>2010</w:t>
+            </w:r>
+          </w:p>
+        </w:tc>
+      </w:tr>
+      <w:tr>
+        <w:tc>
+          <w:tcPr>
+            <w:tcW w:type="dxa" w:w="2400"/>
+          </w:tcPr>
+          <w:p>
+            <w:r>
+              <w:t>min_dpi</w:t>
+            </w:r>
+          </w:p>
+        </w:tc>
+        <w:tc>
+          <w:tcPr>
+            <w:tcW w:type="dxa" w:w="3600"/>
+          </w:tcPr>
+          <w:p>
+            <w:r>
+              <w:t>Legkisebb felbontás (DPI)</w:t>
+            </w:r>
+          </w:p>
+        </w:tc>
+        <w:tc>
+          <w:tcPr>
+            <w:tcW w:type="dxa" w:w="3400"/>
+          </w:tcPr>
+          <w:p>
+            <w:r>
+              <w:t>96.0</w:t>
+            </w:r>
+          </w:p>
+        </w:tc>
+      </w:tr>
+      <w:tr>
+        <w:tc>
+          <w:tcPr>
+            <w:tcW w:type="dxa" w:w="2400"/>
+          </w:tcPr>
+          <w:p>
+            <w:r>
+              <w:t>allowed_types</w:t>
+            </w:r>
+          </w:p>
+        </w:tc>
+        <w:tc>
+          <w:tcPr>
+            <w:tcW w:type="dxa" w:w="3600"/>
+          </w:tcPr>
+          <w:p>
+            <w:r>
+              <w:t>Megengedett képtípusok</w:t>
+            </w:r>
+          </w:p>
+        </w:tc>
+        <w:tc>
+          <w:tcPr>
+            <w:tcW w:type="dxa" w:w="3400"/>
+          </w:tcPr>
+          <w:p>
+            <w:r>
+              <w:t>["RGB", "greyscale", "B&amp;W", "CMYK"]</w:t>
+            </w:r>
+          </w:p>
+        </w:tc>
+      </w:tr>
+    </w:tbl>
+    <w:p/>
+    <w:p>
+      <w:r>
+        <w:t>A képtípusokat a fájlban az azonosítójukkal kell megadni:</w:t>
+      </w:r>
+    </w:p>
+    <w:tbl>
+      <w:tblPr>
+        <w:tblStyle w:val="TableGrid"/>
+        <w:tblW w:type="auto" w:w="0"/>
+        <w:tblLayout w:type="fixed"/>
+        <w:tblLook w:firstColumn="1" w:firstRow="1" w:lastColumn="0" w:lastRow="0" w:noHBand="0" w:noVBand="1" w:val="04A0"/>
+      </w:tblPr>
+      <w:tblGrid>
+        <w:gridCol w:w="4000"/>
+        <w:gridCol w:w="5400"/>
+      </w:tblGrid>
+      <w:tr>
+        <w:tc>
+          <w:tcPr>
+            <w:tcW w:type="dxa" w:w="4000"/>
+            <w:shd w:val="clear" w:color="auto" w:fill="D9E2F3"/>
+          </w:tcPr>
+          <w:p>
+            <w:r/>
+            <w:r>
+              <w:rPr>
+                <w:b/>
+              </w:rPr>
+              <w:t>Azonosító a fájlban</w:t>
+            </w:r>
+          </w:p>
+        </w:tc>
+        <w:tc>
+          <w:tcPr>
+            <w:tcW w:type="dxa" w:w="5400"/>
+            <w:shd w:val="clear" w:color="auto" w:fill="D9E2F3"/>
+          </w:tcPr>
+          <w:p>
+            <w:r/>
+            <w:r>
+              <w:rPr>
+                <w:b/>
+              </w:rPr>
+              <w:t>Képtípus a felületen</w:t>
+            </w:r>
+          </w:p>
+        </w:tc>
+      </w:tr>
+      <w:tr>
+        <w:tc>
+          <w:tcPr>
+            <w:tcW w:type="dxa" w:w="4000"/>
+          </w:tcPr>
+          <w:p>
+            <w:r>
+              <w:t>RGB</w:t>
+            </w:r>
+          </w:p>
+        </w:tc>
+        <w:tc>
+          <w:tcPr>
+            <w:tcW w:type="dxa" w:w="5400"/>
+          </w:tcPr>
+          <w:p>
+            <w:r>
+              <w:t>RGB (színes)</w:t>
+            </w:r>
+          </w:p>
+        </w:tc>
+      </w:tr>
+      <w:tr>
+        <w:tc>
+          <w:tcPr>
+            <w:tcW w:type="dxa" w:w="4000"/>
+          </w:tcPr>
+          <w:p>
+            <w:r>
+              <w:t>RGBA</w:t>
+            </w:r>
+          </w:p>
+        </w:tc>
+        <w:tc>
+          <w:tcPr>
+            <w:tcW w:type="dxa" w:w="5400"/>
+          </w:tcPr>
+          <w:p>
+            <w:r>
+              <w:t>RGBA (színes, átlátszó)</w:t>
+            </w:r>
+          </w:p>
+        </w:tc>
+      </w:tr>
+      <w:tr>
+        <w:tc>
+          <w:tcPr>
+            <w:tcW w:type="dxa" w:w="4000"/>
+          </w:tcPr>
+          <w:p>
+            <w:r>
+              <w:t>greyscale</w:t>
+            </w:r>
+          </w:p>
+        </w:tc>
+        <w:tc>
+          <w:tcPr>
+            <w:tcW w:type="dxa" w:w="5400"/>
+          </w:tcPr>
+          <w:p>
+            <w:r>
+              <w:t>szürkeárnyalatos</w:t>
+            </w:r>
+          </w:p>
+        </w:tc>
+      </w:tr>
+      <w:tr>
+        <w:tc>
+          <w:tcPr>
+            <w:tcW w:type="dxa" w:w="4000"/>
+          </w:tcPr>
+          <w:p>
+            <w:r>
+              <w:t>B&amp;W</w:t>
+            </w:r>
+          </w:p>
+        </w:tc>
+        <w:tc>
+          <w:tcPr>
+            <w:tcW w:type="dxa" w:w="5400"/>
+          </w:tcPr>
+          <w:p>
+            <w:r>
+              <w:t>fekete-fehér</w:t>
+            </w:r>
+          </w:p>
+        </w:tc>
+      </w:tr>
+      <w:tr>
+        <w:tc>
+          <w:tcPr>
+            <w:tcW w:type="dxa" w:w="4000"/>
+          </w:tcPr>
+          <w:p>
+            <w:r>
+              <w:t>CMYK</w:t>
+            </w:r>
+          </w:p>
+        </w:tc>
+        <w:tc>
+          <w:tcPr>
+            <w:tcW w:type="dxa" w:w="5400"/>
+          </w:tcPr>
+          <w:p>
+            <w:r>
+              <w:t>CMYK</w:t>
+            </w:r>
+          </w:p>
+        </w:tc>
+      </w:tr>
+      <w:tr>
+        <w:tc>
+          <w:tcPr>
+            <w:tcW w:type="dxa" w:w="4000"/>
+          </w:tcPr>
+          <w:p>
+            <w:r>
+              <w:t>palette</w:t>
+            </w:r>
+          </w:p>
+        </w:tc>
+        <w:tc>
+          <w:tcPr>
+            <w:tcW w:type="dxa" w:w="5400"/>
+          </w:tcPr>
+          <w:p>
+            <w:r>
+              <w:t>palettás</w:t>
+            </w:r>
+          </w:p>
+        </w:tc>
+      </w:tr>
+    </w:tbl>
+    <w:p/>
+    <w:p>
+      <w:pPr>
+        <w:pStyle w:val="ListBullet"/>
+      </w:pPr>
+      <w:r>
+        <w:t>A hiányzó kulcsok az alapértéket kapják, így elég csak az eltérő értékeket megadni.</w:t>
+      </w:r>
+    </w:p>
+    <w:p>
+      <w:pPr>
+        <w:pStyle w:val="ListBullet"/>
+      </w:pPr>
+      <w:r>
+        <w:t>Tizedesponttal kell írni (2.5), a pixelértékek egész számok.</w:t>
+      </w:r>
+    </w:p>
+    <w:p>
+      <w:pPr>
+        <w:pStyle w:val="ListBullet"/>
+      </w:pPr>
+      <w:r>
+        <w:t>Ismeretlen kulcs, hibás érték vagy ellentmondás (pl. a minimum nagyobb a maximumnál) esetén a program figyelmeztet, és az alapértelmezett feltételekkel indul.</w:t>
+      </w:r>
+    </w:p>
+    <w:p>
+      <w:pPr>
+        <w:pStyle w:val="Heading2"/>
+      </w:pPr>
+      <w:r>
+        <w:t>13. Hibaelhárítás a haladó beállításoknál</w:t>
+      </w:r>
+    </w:p>
+    <w:tbl>
+      <w:tblPr>
+        <w:tblStyle w:val="TableGrid"/>
+        <w:tblW w:type="auto" w:w="0"/>
+        <w:tblLayout w:type="fixed"/>
+        <w:tblLook w:firstColumn="1" w:firstRow="1" w:lastColumn="0" w:lastRow="0" w:noHBand="0" w:noVBand="1" w:val="04A0"/>
+      </w:tblPr>
+      <w:tblGrid>
+        <w:gridCol w:w="3400"/>
+        <w:gridCol w:w="6000"/>
+      </w:tblGrid>
+      <w:tr>
+        <w:tc>
+          <w:tcPr>
+            <w:tcW w:type="dxa" w:w="3400"/>
+            <w:shd w:val="clear" w:color="auto" w:fill="D9E2F3"/>
+          </w:tcPr>
+          <w:p>
+            <w:r/>
+            <w:r>
+              <w:rPr>
+                <w:b/>
+              </w:rPr>
+              <w:t>Üzenet / helyzet</w:t>
+            </w:r>
+          </w:p>
+        </w:tc>
+        <w:tc>
+          <w:tcPr>
+            <w:tcW w:type="dxa" w:w="6000"/>
+            <w:shd w:val="clear" w:color="auto" w:fill="D9E2F3"/>
+          </w:tcPr>
+          <w:p>
+            <w:r/>
+            <w:r>
+              <w:rPr>
+                <w:b/>
+              </w:rPr>
+              <w:t>Teendő</w:t>
+            </w:r>
+          </w:p>
+        </w:tc>
+      </w:tr>
       <w:tr>
         <w:tc>
           <w:tcPr>
@@ -1965,6 +2509,50 @@
           <w:p>
             <w:r>
               <w:t>A szöveg hiányzik a locals.json magyar részéből - pótolja a hiányzó kulcsot.</w:t>
+            </w:r>
+          </w:p>
+        </w:tc>
+      </w:tr>
+      <w:tr>
+        <w:tc>
+          <w:tcPr>
+            <w:tcW w:type="dxa" w:w="3400"/>
+          </w:tcPr>
+          <w:p>
+            <w:r>
+              <w:t>Kulcs (pl. prop.width) látszik szöveg helyett</w:t>
+            </w:r>
+          </w:p>
+        </w:tc>
+        <w:tc>
+          <w:tcPr>
+            <w:tcW w:type="dxa" w:w="6000"/>
+          </w:tcPr>
+          <w:p>
+            <w:r>
+              <w:t>A szöveg az angol részből is hiányzik - pótolja.</w:t>
+            </w:r>
+          </w:p>
+        </w:tc>
+      </w:tr>
+      <w:tr>
+        <w:tc>
+          <w:tcPr>
+            <w:tcW w:type="dxa" w:w="3400"/>
+          </w:tcPr>
+          <w:p>
+            <w:r>
+              <w:t>Ékezetes betűk helyett furcsa jelek</w:t>
+            </w:r>
+          </w:p>
+        </w:tc>
+        <w:tc>
+          <w:tcPr>
+            <w:tcW w:type="dxa" w:w="6000"/>
+          </w:tcPr>
+          <w:p>
+            <w:r>
+              <w:t>Mentse a locals.json-t UTF-8 kódolással.</w:t>
             </w:r>
           </w:p>
         </w:tc>
@@ -2194,6 +2782,12 @@
     </w:lvlOverride>
   </w:num>
   <w:num w:numId="12">
+    <w:abstractNumId w:val="7"/>
+    <w:lvlOverride w:ilvl="0">
+      <w:startOverride w:val="1"/>
+    </w:lvlOverride>
+  </w:num>
+  <w:num w:numId="13">
     <w:abstractNumId w:val="7"/>
     <w:lvlOverride w:ilvl="0">
       <w:startOverride w:val="1"/>

</xml_diff>

<commit_message>
Check command line parameters and add localized --help
Replace argparse with a small parser so that every message is localized:
- -h/--help (and /?) shows the parameter description in the selected
  language (Hungarian by default, English with --lang en --help).
- Missing values, duplicate or unknown parameters, extra arguments,
  nonexistent or incompatible --config/--locals files, unknown --lang
  codes and invalid images are reported together; the program exits
  with code 2 without opening the window.
- Fix --version (and help/errors) in the exe: it has no console, so the
  output is now shown in a window when stdout/stderr are missing.

Localization file errors are translated too, and a binary file given as
--config no longer raises an unhandled decode error. Adds 22 command line
tests and documents the behaviour in the technical documentation and
both user manuals.

Co-Authored-By: Claude Opus 5.5 <noreply@anthropic.com>
</commit_message>
<xml_diff>
--- a/docs/TrademarkImage_Felhasznaloi_kezikonyv_HU.docx
+++ b/docs/TrademarkImage_Felhasznaloi_kezikonyv_HU.docx
@@ -1515,6 +1515,28 @@
           </w:tcPr>
           <w:p>
             <w:r>
+              <w:t>-h, --help</w:t>
+            </w:r>
+          </w:p>
+        </w:tc>
+        <w:tc>
+          <w:tcPr>
+            <w:tcW w:type="dxa" w:w="7200"/>
+          </w:tcPr>
+          <w:p>
+            <w:r>
+              <w:t>Megjeleníti a paraméterek leírását. Angolul: --lang en --help.</w:t>
+            </w:r>
+          </w:p>
+        </w:tc>
+      </w:tr>
+      <w:tr>
+        <w:tc>
+          <w:tcPr>
+            <w:tcW w:type="dxa" w:w="2200"/>
+          </w:tcPr>
+          <w:p>
+            <w:r>
               <w:t>--version</w:t>
             </w:r>
           </w:p>
@@ -1525,7 +1547,7 @@
           </w:tcPr>
           <w:p>
             <w:r>
-              <w:t>Kiírja a program verziószámát.</w:t>
+              <w:t>Megjeleníti a program verziószámát.</w:t>
             </w:r>
           </w:p>
         </w:tc>
@@ -1533,8 +1555,85 @@
     </w:tbl>
     <w:p/>
     <w:p>
+      <w:pPr>
+        <w:pStyle w:val="ListBullet"/>
+      </w:pPr>
+      <w:r>
+        <w:t>Az érték egyenlőségjellel is megadható (pl. --lang=en). A szóközt tartalmazó fájlneveket tegye idézőjelek közé.</w:t>
+      </w:r>
+    </w:p>
+    <w:p>
+      <w:pPr>
+        <w:pStyle w:val="ListBullet"/>
+      </w:pPr>
       <w:r>
         <w:t>Az indítási könyvtár dupla kattintásos indításnál az exe mappája. Parancsikon esetén a parancsikon „Indítás helye” mezője adja meg.</w:t>
+      </w:r>
+    </w:p>
+    <w:p>
+      <w:pPr>
+        <w:pStyle w:val="ListBullet"/>
+      </w:pPr>
+      <w:r>
+        <w:t>A súgó egy külön ablakban, a verziószám egy üzenetablakban jelenik meg; ezután a program kilép.</w:t>
+      </w:r>
+    </w:p>
+    <w:p>
+      <w:pPr>
+        <w:pStyle w:val="Heading3"/>
+      </w:pPr>
+      <w:r>
+        <w:t>10.1 Hibás paraméterek</w:t>
+      </w:r>
+    </w:p>
+    <w:p>
+      <w:r>
+        <w:t>A program induláskor ellenőrzi a paramétereket. Ha valamelyik hibás, egy hibaüzenetben felsorolja az összes problémát, és nem indul el. Hibának számít például:</w:t>
+      </w:r>
+    </w:p>
+    <w:p>
+      <w:pPr>
+        <w:pStyle w:val="ListBullet"/>
+      </w:pPr>
+      <w:r>
+        <w:t>a --config, a --locals vagy a --lang után hiányzik az érték;</w:t>
+      </w:r>
+    </w:p>
+    <w:p>
+      <w:pPr>
+        <w:pStyle w:val="ListBullet"/>
+      </w:pPr>
+      <w:r>
+        <w:t>a megadott fájl nem létezik, mappa, vagy nem megfelelő (pl. kép vagy szövegfájl a --config után);</w:t>
+      </w:r>
+    </w:p>
+    <w:p>
+      <w:pPr>
+        <w:pStyle w:val="ListBullet"/>
+      </w:pPr>
+      <w:r>
+        <w:t>ismeretlen nyelvkód a --lang után (az üzenet felsorolja az elérhető nyelveket);</w:t>
+      </w:r>
+    </w:p>
+    <w:p>
+      <w:pPr>
+        <w:pStyle w:val="ListBullet"/>
+      </w:pPr>
+      <w:r>
+        <w:t>a megadott kép nem létezik vagy nem kép;</w:t>
+      </w:r>
+    </w:p>
+    <w:p>
+      <w:pPr>
+        <w:pStyle w:val="ListBullet"/>
+      </w:pPr>
+      <w:r>
+        <w:t>ismeretlen vagy többször megadott paraméter, illetve egynél több képfájl.</w:t>
+      </w:r>
+    </w:p>
+    <w:p>
+      <w:r>
+        <w:t>A hibaüzenet a kiválasztott nyelven jelenik meg, és a végén megmutatja, hogyan kérhető súgó. Szkriptekből a kilépési kód is vizsgálható: 0 = rendben, 2 = parancssori hiba.</w:t>
       </w:r>
     </w:p>
     <w:p>
@@ -2415,7 +2514,7 @@
         <w:pStyle w:val="ListBullet"/>
       </w:pPr>
       <w:r>
-        <w:t>Ismeretlen kulcs, hibás érték vagy ellentmondás (pl. a minimum nagyobb a maximumnál) esetén a program figyelmeztet, és az alapértelmezett feltételekkel indul.</w:t>
+        <w:t>Ismeretlen kulcs, hibás érték vagy ellentmondás (pl. a minimum nagyobb a maximumnál) esetén: ha a fájlt a --config adta meg, a program hibaüzenettel kilép; az indítási könyvtár criterias.json fájljánál figyelmeztet, és az alapértelmezett feltételekkel indul.</w:t>
       </w:r>
     </w:p>
     <w:p>
@@ -2476,6 +2575,28 @@
           </w:tcPr>
           <w:p>
             <w:r>
+              <w:t>Parancssori hiba, a program nem indul</w:t>
+            </w:r>
+          </w:p>
+        </w:tc>
+        <w:tc>
+          <w:tcPr>
+            <w:tcW w:type="dxa" w:w="6000"/>
+          </w:tcPr>
+          <w:p>
+            <w:r>
+              <w:t>Javítsa a hibaüzenetben felsorolt paramétereket (lásd 10.1). A paraméterek leírása: --help.</w:t>
+            </w:r>
+          </w:p>
+        </w:tc>
+      </w:tr>
+      <w:tr>
+        <w:tc>
+          <w:tcPr>
+            <w:tcW w:type="dxa" w:w="3400"/>
+          </w:tcPr>
+          <w:p>
+            <w:r>
               <w:t>Figyelmeztetés indításkor</w:t>
             </w:r>
           </w:p>
@@ -2486,7 +2607,7 @@
           </w:tcPr>
           <w:p>
             <w:r>
-              <w:t>A feltételfájl vagy a locals.json hibás / nem található, vagy ismeretlen a --lang nyelvkód. A program az alapértelmezett beállításokkal fut.</w:t>
+              <w:t>Az indítási könyvtárban lévő criterias.json vagy locals.json hibás. A program az alapértelmezett beállításokkal fut.</w:t>
             </w:r>
           </w:p>
         </w:tc>

</xml_diff>

<commit_message>
Add maximum resolution and progressive JPEG criteria
- New criterion max_dpi (default 600): the larger of the horizontal and
  vertical resolution must not exceed it; the resolution check is now a
  range (min_dpi-max_dpi). Unchanged x/y resolutions are kept when
  converting, otherwise the output DPI is clamped into the range.
- New criterion allow_progressive_jpeg (default false): progressive JPEG
  files fail with a 'JPEG encoding' button; the fix is to choose
  baseline, and the converter always writes baseline JPEG.
- Criteria panel gets a maximum resolution field and a 'progressive JPEG
  allowed' check box; the image info shows the JPEG encoding.
- Older criteria files without the new keys still load with the defaults.
- Texts in Hungarian and English, 22 new tests, documentation and the
  example criteria file updated; version 1.2.0.

Co-Authored-By: Claude Opus 5.5 <noreply@anthropic.com>
</commit_message>
<xml_diff>
--- a/docs/TrademarkImage_Felhasznaloi_kezikonyv_HU.docx
+++ b/docs/TrademarkImage_Felhasznaloi_kezikonyv_HU.docx
@@ -24,7 +24,7 @@
           <w:color w:val="555555"/>
           <w:sz w:val="24"/>
         </w:rPr>
-        <w:t>Felhasználói kézikönyv (Trademark Image Checker, 1.1.0 verzió)</w:t>
+        <w:t>Felhasználói kézikönyv (Trademark Image Checker, 1.2.0 verzió)</w:t>
       </w:r>
     </w:p>
     <w:p>
@@ -329,7 +329,7 @@
     </w:p>
     <w:p>
       <w:r>
-        <w:t>Minden nem teljesülő feltételhez egy piros gomb tartozik, amelyen a feltétel neve, a kép jelenlegi értéke és zárójelben a követelmény olvasható, például: „Szélesség: 4000 px (945-2835 px)”. A lehetséges gombok: Fájlméret, Szélesség, Magasság, Felbontás és Képtípus. A felbontásnál „nincs megadva” látható, ha a fájl nem tárol DPI értéket.</w:t>
+        <w:t>Minden nem teljesülő feltételhez egy piros gomb tartozik, amelyen a feltétel neve, a kép jelenlegi értéke és zárójelben a követelmény olvasható, például: „Szélesség: 4000 px (945-2835 px)”. A lehetséges gombok: Fájlméret, Szélesség, Magasság, Felbontás, Képtípus és JPEG kódolás. A felbontásnál „nincs megadva” látható, ha a fájl nem tárol DPI értéket.</w:t>
       </w:r>
     </w:p>
     <w:p>
@@ -401,7 +401,7 @@
         <w:t xml:space="preserve">Felbontás: </w:t>
       </w:r>
       <w:r>
-        <w:t>egész szám DPI-ben. A felbontás csak a fájlban tárolt adat, a pixelméretet nem változtatja.</w:t>
+        <w:t>egész szám DPI-ben, a legkisebb és a legnagyobb felbontás között (alapesetben 96-600 DPI). A felbontás csak a fájlban tárolt adat, a pixelméretet nem változtatja.</w:t>
       </w:r>
     </w:p>
     <w:p>
@@ -430,6 +430,20 @@
       </w:r>
       <w:r>
         <w:t>a listából választható ki a megengedett típusok egyike.</w:t>
+      </w:r>
+    </w:p>
+    <w:p>
+      <w:pPr>
+        <w:pStyle w:val="ListBullet"/>
+      </w:pPr>
+      <w:r>
+        <w:rPr>
+          <w:b/>
+        </w:rPr>
+        <w:t xml:space="preserve">JPEG kódolás: </w:t>
+      </w:r>
+      <w:r>
+        <w:t>progresszív JPEG esetén válassza az „alap (baseline)” értéket; a program a képet alap JPEG-ként menti újra.</w:t>
       </w:r>
     </w:p>
     <w:p>
@@ -668,7 +682,7 @@
     <w:p/>
     <w:p>
       <w:r>
-        <w:t>Átalakításkor az átlátszó részek fehér hátteret kapnak (kivéve RGBA típus esetén), a fekete-fehér átalakítás 50%-os küszöbbel történik, a kép pedig a fényképezőgép által tárolt tájolás szerint elforgatásra kerül.</w:t>
+        <w:t>Átalakításkor a JPEG fájlok mindig alap (nem progresszív) kódolással készülnek, az átlátszó részek fehér hátteret kapnak (kivéve RGBA típus esetén), a fekete-fehér átalakítás 50%-os küszöbbel történik, a kép pedig a fényképezőgép által tárolt tájolás szerint elforgatásra kerül.</w:t>
       </w:r>
     </w:p>
     <w:p>
@@ -861,6 +875,28 @@
           </w:tcPr>
           <w:p>
             <w:r>
+              <w:t>Legnagyobb felbontás (DPI)</w:t>
+            </w:r>
+          </w:p>
+        </w:tc>
+        <w:tc>
+          <w:tcPr>
+            <w:tcW w:type="dxa" w:w="5400"/>
+          </w:tcPr>
+          <w:p>
+            <w:r>
+              <w:t>600</w:t>
+            </w:r>
+          </w:p>
+        </w:tc>
+      </w:tr>
+      <w:tr>
+        <w:tc>
+          <w:tcPr>
+            <w:tcW w:type="dxa" w:w="4000"/>
+          </w:tcPr>
+          <w:p>
+            <w:r>
               <w:t>Megengedett képtípusok</w:t>
             </w:r>
           </w:p>
@@ -872,6 +908,28 @@
           <w:p>
             <w:r>
               <w:t>RGB, szürkeárnyalatos, fekete-fehér, CMYK</w:t>
+            </w:r>
+          </w:p>
+        </w:tc>
+      </w:tr>
+      <w:tr>
+        <w:tc>
+          <w:tcPr>
+            <w:tcW w:type="dxa" w:w="4000"/>
+          </w:tcPr>
+          <w:p>
+            <w:r>
+              <w:t>Progresszív JPEG megengedett</w:t>
+            </w:r>
+          </w:p>
+        </w:tc>
+        <w:tc>
+          <w:tcPr>
+            <w:tcW w:type="dxa" w:w="5400"/>
+          </w:tcPr>
+          <w:p>
+            <w:r>
+              <w:t>nem (kikapcsolva)</w:t>
             </w:r>
           </w:p>
         </w:tc>
@@ -2005,7 +2063,33 @@
           <w:rFonts w:ascii="Consolas" w:hAnsi="Consolas" w:eastAsia="Consolas"/>
           <w:sz w:val="19"/>
         </w:rPr>
-        <w:t xml:space="preserve">  "allowed_types": ["RGB", "greyscale", "B&amp;W", "CMYK"]</w:t>
+        <w:t xml:space="preserve">  "max_dpi": 600.0,</w:t>
+      </w:r>
+    </w:p>
+    <w:p>
+      <w:pPr>
+        <w:spacing w:after="0"/>
+        <w:ind w:left="360"/>
+      </w:pPr>
+      <w:r>
+        <w:rPr>
+          <w:rFonts w:ascii="Consolas" w:hAnsi="Consolas" w:eastAsia="Consolas"/>
+          <w:sz w:val="19"/>
+        </w:rPr>
+        <w:t xml:space="preserve">  "allowed_types": ["RGB", "greyscale", "B&amp;W", "CMYK"],</w:t>
+      </w:r>
+    </w:p>
+    <w:p>
+      <w:pPr>
+        <w:spacing w:after="0"/>
+        <w:ind w:left="360"/>
+      </w:pPr>
+      <w:r>
+        <w:rPr>
+          <w:rFonts w:ascii="Consolas" w:hAnsi="Consolas" w:eastAsia="Consolas"/>
+          <w:sz w:val="19"/>
+        </w:rPr>
+        <w:t xml:space="preserve">  "allow_progressive_jpeg": false</w:t>
       </w:r>
     </w:p>
     <w:p>
@@ -2284,6 +2368,38 @@
           </w:tcPr>
           <w:p>
             <w:r>
+              <w:t>max_dpi</w:t>
+            </w:r>
+          </w:p>
+        </w:tc>
+        <w:tc>
+          <w:tcPr>
+            <w:tcW w:type="dxa" w:w="3600"/>
+          </w:tcPr>
+          <w:p>
+            <w:r>
+              <w:t>Legnagyobb felbontás (DPI)</w:t>
+            </w:r>
+          </w:p>
+        </w:tc>
+        <w:tc>
+          <w:tcPr>
+            <w:tcW w:type="dxa" w:w="3400"/>
+          </w:tcPr>
+          <w:p>
+            <w:r>
+              <w:t>600.0</w:t>
+            </w:r>
+          </w:p>
+        </w:tc>
+      </w:tr>
+      <w:tr>
+        <w:tc>
+          <w:tcPr>
+            <w:tcW w:type="dxa" w:w="2400"/>
+          </w:tcPr>
+          <w:p>
+            <w:r>
               <w:t>allowed_types</w:t>
             </w:r>
           </w:p>
@@ -2305,6 +2421,38 @@
           <w:p>
             <w:r>
               <w:t>["RGB", "greyscale", "B&amp;W", "CMYK"]</w:t>
+            </w:r>
+          </w:p>
+        </w:tc>
+      </w:tr>
+      <w:tr>
+        <w:tc>
+          <w:tcPr>
+            <w:tcW w:type="dxa" w:w="2400"/>
+          </w:tcPr>
+          <w:p>
+            <w:r>
+              <w:t>allow_progressive_jpeg</w:t>
+            </w:r>
+          </w:p>
+        </w:tc>
+        <w:tc>
+          <w:tcPr>
+            <w:tcW w:type="dxa" w:w="3600"/>
+          </w:tcPr>
+          <w:p>
+            <w:r>
+              <w:t>Progresszív JPEG megengedett</w:t>
+            </w:r>
+          </w:p>
+        </w:tc>
+        <w:tc>
+          <w:tcPr>
+            <w:tcW w:type="dxa" w:w="3400"/>
+          </w:tcPr>
+          <w:p>
+            <w:r>
+              <w:t>false (true = megengedett)</w:t>
             </w:r>
           </w:p>
         </w:tc>

</xml_diff>

<commit_message>
Add About button and version window with copyright and source
An About (Névjegy) button in the upper left corner of the main window
opens the version window: program name and version, the copyright line
'(c) Gyula Mentler SBGK.HU' ('Mentler Gyula' in Hungarian) and the
source URL as a clickable link. --version shows the same window in the
exe and prints the same three lines on a console. Texts are in
locals.json; tests and documentation updated.

Co-Authored-By: Claude Opus 5.5 <noreply@anthropic.com>
</commit_message>
<xml_diff>
--- a/docs/TrademarkImage_Felhasznaloi_kezikonyv_HU.docx
+++ b/docs/TrademarkImage_Felhasznaloi_kezikonyv_HU.docx
@@ -145,6 +145,28 @@
                 <w:b/>
               </w:rPr>
               <w:t>Leírás</w:t>
+            </w:r>
+          </w:p>
+        </w:tc>
+      </w:tr>
+      <w:tr>
+        <w:tc>
+          <w:tcPr>
+            <w:tcW w:type="dxa" w:w="2600"/>
+          </w:tcPr>
+          <w:p>
+            <w:r>
+              <w:t>Névjegy (bal felső sarok)</w:t>
+            </w:r>
+          </w:p>
+        </w:tc>
+        <w:tc>
+          <w:tcPr>
+            <w:tcW w:type="dxa" w:w="6800"/>
+          </w:tcPr>
+          <w:p>
+            <w:r>
+              <w:t>Megjeleníti a program verziószámát, a szerzői jogot és a forráskód címét (a cím kattintható).</w:t>
             </w:r>
           </w:p>
         </w:tc>
@@ -1605,7 +1627,7 @@
           </w:tcPr>
           <w:p>
             <w:r>
-              <w:t>Megjeleníti a program verziószámát.</w:t>
+              <w:t>Megjeleníti a verzióablakot (ugyanazt, mint a Névjegy gomb).</w:t>
             </w:r>
           </w:p>
         </w:tc>
@@ -1633,7 +1655,7 @@
         <w:pStyle w:val="ListBullet"/>
       </w:pPr>
       <w:r>
-        <w:t>A súgó egy külön ablakban, a verziószám egy üzenetablakban jelenik meg; ezután a program kilép.</w:t>
+        <w:t>A súgó egy külön ablakban, a verziószám a Névjegy ablakban jelenik meg; ezután a program kilép.</w:t>
       </w:r>
     </w:p>
     <w:p>

</xml_diff>

<commit_message>
Accept spaces around '=' and any case in command line parameters
--lang=en already worked, but '--lang = en', '--lang= en', '--lang =en'
and '--LANG=en' were misread (the '=' or the value became the image file
or an unknown parameter). The parser now accepts all of these forms for
--config, --lang and --locals, and parameter names (including --help and
--version) are case-insensitive; values are kept as given. Help text,
documentation and tests updated.

Co-Authored-By: Claude Opus 5.5 <noreply@anthropic.com>
</commit_message>
<xml_diff>
--- a/docs/TrademarkImage_Felhasznaloi_kezikonyv_HU.docx
+++ b/docs/TrademarkImage_Felhasznaloi_kezikonyv_HU.docx
@@ -1639,7 +1639,15 @@
         <w:pStyle w:val="ListBullet"/>
       </w:pPr>
       <w:r>
-        <w:t>Az érték egyenlőségjellel is megadható (pl. --lang=en). A szóközt tartalmazó fájlneveket tegye idézőjelek közé.</w:t>
+        <w:t>Az érték szóközzel vagy egyenlőségjellel adható meg; az egyenlőségjel körül szóköz is lehet: --lang en, --lang=en, --lang = en. A szóközt tartalmazó fájlneveket tegye idézőjelek közé.</w:t>
+      </w:r>
+    </w:p>
+    <w:p>
+      <w:pPr>
+        <w:pStyle w:val="ListBullet"/>
+      </w:pPr>
+      <w:r>
+        <w:t>A paraméterek nevében a kis- és nagybetű nem számít (--LANG=en is jó).</w:t>
       </w:r>
     </w:p>
     <w:p>

</xml_diff>